<commit_message>
Overlegdocument lean gemaakt, plus drie ontbrekende vragen
Uitleg ingekort en de aparte risicosectie opgegaan in de vragen. Van acht naar
dertien vragen, maar korter: circa 970 woorden tegenover het dubbele.

Drie vragen die ontbraken:

- Wie doet de analyse, en is dat begroot. Stond in de eerste versie en was bij het
  herbouwen weggevallen. WP3 levert op maand 42; zonder antwoord landt het bij de
  coordinerend onderzoeker.
- Komt er een budgetimpactanalyse. Het manuscript noemt er geen, terwijl de studie
  zich expliciet richt op een terugbetalingsbeslissing. Het RIZIV vraagt daar
  doorgaans een BIA naast de kosteneffectiviteit, en KCE 400 behandelt beide.
- De economische evaluatie is niet apart gepowerd. De 144 volgen uit het klinische
  eindpunt en de wervingscapaciteit. Aanvaardbaar, maar hoort expliciet vermeld.

En een vierde: wie eerste auteur wordt van het economische paper.

Co-Authored-By: Claude Opus 5 <noreply@anthropic.com>
</commit_message>
<xml_diff>
--- a/PARADISE_overleg_gezondheidseconomie.docx
+++ b/PARADISE_overleg_gezondheidseconomie.docx
@@ -23,14 +23,14 @@
         <w:rPr>
           <w:b/>
           <w:color w:val="00407A"/>
-          <w:sz w:val="38"/>
+          <w:sz w:val="36"/>
         </w:rPr>
         <w:t>Gezondheidseconomie — overleg Koen Putman</w:t>
       </w:r>
     </w:p>
     <w:p>
       <w:pPr>
-        <w:spacing w:after="160"/>
+        <w:spacing w:after="140"/>
       </w:pPr>
       <w:r>
         <w:rPr>
@@ -43,7 +43,7 @@
     </w:p>
     <w:p>
       <w:pPr>
-        <w:spacing w:after="120"/>
+        <w:spacing w:after="100"/>
       </w:pPr>
       <w:r>
         <w:rPr>
@@ -51,25 +51,12 @@
           <w:color w:val="1B2630"/>
           <w:sz w:val="19"/>
         </w:rPr>
-        <w:t>Het manuscript legt de opzet van de economische evaluatie al vrij volledig vast. Wat ontbreekt is de uitvoering: de parameters om te rékenen, de regels die bepalen welke bron wint waar twee bronnen hetzelfde meten, en — het zwaarste punt — de gegevens om de interventie zelf te kostprijzen. Want dat is precies waar de terugbetalingsbeslissing over gaat.</w:t>
+        <w:t>De opzet ligt vast in het manuscript. Wat ontbreekt is de uitvoering: wie rekent, met welke parameters, en welke bron wint waar er twee hetzelfde meten. Dertien vragen, waarvan vier de eCRF’s raken en dus vóór de versie-lock moeten.</w:t>
       </w:r>
     </w:p>
     <w:p>
       <w:pPr>
-        <w:spacing w:after="40"/>
-      </w:pPr>
-      <w:r>
-        <w:rPr>
-          <w:b w:val="0"/>
-          <w:color w:val="5A6A78"/>
-          <w:sz w:val="16"/>
-        </w:rPr>
-        <w:t>De KCE-richtlijn is nagekeken in de derde editie van mei 2025 (rapport 400), niet de tweede van 2012. Instrumenten item voor item vergeleken; terugblikperiodes nagekeken in de iMTA-handleidingen.</w:t>
-      </w:r>
-    </w:p>
-    <w:p>
-      <w:pPr>
-        <w:spacing w:before="300" w:after="100"/>
+        <w:spacing w:before="260" w:after="80"/>
       </w:pPr>
       <w:r>
         <w:rPr>
@@ -77,20 +64,7 @@
           <w:color w:val="FF7A00"/>
           <w:sz w:val="22"/>
         </w:rPr>
-        <w:t>1  Wat vastligt — niet heropenen</w:t>
-      </w:r>
-    </w:p>
-    <w:p>
-      <w:pPr>
-        <w:spacing w:after="100"/>
-      </w:pPr>
-      <w:r>
-        <w:rPr>
-          <w:b w:val="0"/>
-          <w:color w:val="5A6A78"/>
-          <w:sz w:val="17"/>
-        </w:rPr>
-        <w:t>Staat zo in het manuscript. Hier alleen zodat het overleg er geen tijd aan besteedt.</w:t>
+        <w:t>1  Vastligt — niet heropenen</w:t>
       </w:r>
     </w:p>
     <w:tbl>
@@ -115,12 +89,12 @@
       <w:tr>
         <w:tc>
           <w:tcPr>
-            <w:tcW w:type="dxa" w:w="2494"/>
+            <w:tcW w:type="dxa" w:w="1928"/>
             <w:shd w:val="clear" w:fill="1D8DB0"/>
           </w:tcPr>
           <w:p>
             <w:pPr>
-              <w:spacing w:before="40" w:after="40"/>
+              <w:spacing w:before="20" w:after="20"/>
             </w:pPr>
             <w:r>
               <w:rPr>
@@ -134,12 +108,12 @@
         </w:tc>
         <w:tc>
           <w:tcPr>
-            <w:tcW w:type="dxa" w:w="7370"/>
+            <w:tcW w:type="dxa" w:w="7937"/>
             <w:shd w:val="clear" w:fill="1D8DB0"/>
           </w:tcPr>
           <w:p>
             <w:pPr>
-              <w:spacing w:before="40" w:after="40"/>
+              <w:spacing w:before="20" w:after="20"/>
             </w:pPr>
             <w:r>
               <w:rPr>
@@ -155,35 +129,35 @@
       <w:tr>
         <w:tc>
           <w:tcPr>
-            <w:tcW w:type="dxa" w:w="2494"/>
+            <w:tcW w:type="dxa" w:w="1928"/>
           </w:tcPr>
           <w:p>
             <w:pPr>
-              <w:spacing w:before="40" w:after="40"/>
+              <w:spacing w:before="20" w:after="20"/>
             </w:pPr>
             <w:r>
               <w:rPr>
                 <w:color w:val="1B2630"/>
                 <w:sz w:val="17"/>
               </w:rPr>
-              <w:t>Analysetype</w:t>
+              <w:t>Analyse</w:t>
             </w:r>
           </w:p>
         </w:tc>
         <w:tc>
           <w:tcPr>
-            <w:tcW w:type="dxa" w:w="7370"/>
+            <w:tcW w:type="dxa" w:w="7937"/>
           </w:tcPr>
           <w:p>
             <w:pPr>
-              <w:spacing w:before="40" w:after="40"/>
+              <w:spacing w:before="20" w:after="20"/>
             </w:pPr>
             <w:r>
               <w:rPr>
                 <w:color w:val="1B2630"/>
                 <w:sz w:val="17"/>
               </w:rPr>
-              <w:t>Kosteneffectiviteit én kostenutiliteit over 18 maanden.</w:t>
+              <w:t>Kosteneffectiviteit en kostenutiliteit over 18 maanden; ICUR als primair economisch eindpunt.</w:t>
             </w:r>
           </w:p>
         </w:tc>
@@ -191,11 +165,11 @@
       <w:tr>
         <w:tc>
           <w:tcPr>
-            <w:tcW w:type="dxa" w:w="2494"/>
+            <w:tcW w:type="dxa" w:w="1928"/>
           </w:tcPr>
           <w:p>
             <w:pPr>
-              <w:spacing w:before="40" w:after="40"/>
+              <w:spacing w:before="20" w:after="20"/>
             </w:pPr>
             <w:r>
               <w:rPr>
@@ -208,18 +182,18 @@
         </w:tc>
         <w:tc>
           <w:tcPr>
-            <w:tcW w:type="dxa" w:w="7370"/>
+            <w:tcW w:type="dxa" w:w="7937"/>
           </w:tcPr>
           <w:p>
             <w:pPr>
-              <w:spacing w:before="40" w:after="40"/>
+              <w:spacing w:before="20" w:after="20"/>
             </w:pPr>
             <w:r>
               <w:rPr>
                 <w:color w:val="1B2630"/>
                 <w:sz w:val="17"/>
               </w:rPr>
-              <w:t>Betaler in de referentieanalyse, maatschappelijk in de gevoeligheidsanalyse.</w:t>
+              <w:t>Betaler in de referentieanalyse, maatschappelijk in gevoeligheidsanalyse.</w:t>
             </w:r>
           </w:p>
         </w:tc>
@@ -227,47 +201,11 @@
       <w:tr>
         <w:tc>
           <w:tcPr>
-            <w:tcW w:type="dxa" w:w="2494"/>
+            <w:tcW w:type="dxa" w:w="1928"/>
           </w:tcPr>
           <w:p>
             <w:pPr>
-              <w:spacing w:before="40" w:after="40"/>
-            </w:pPr>
-            <w:r>
-              <w:rPr>
-                <w:color w:val="1B2630"/>
-                <w:sz w:val="17"/>
-              </w:rPr>
-              <w:t>Primair economisch eindpunt</w:t>
-            </w:r>
-          </w:p>
-        </w:tc>
-        <w:tc>
-          <w:tcPr>
-            <w:tcW w:type="dxa" w:w="7370"/>
-          </w:tcPr>
-          <w:p>
-            <w:pPr>
-              <w:spacing w:before="40" w:after="40"/>
-            </w:pPr>
-            <w:r>
-              <w:rPr>
-                <w:color w:val="1B2630"/>
-                <w:sz w:val="17"/>
-              </w:rPr>
-              <w:t>De ICUR.</w:t>
-            </w:r>
-          </w:p>
-        </w:tc>
-      </w:tr>
-      <w:tr>
-        <w:tc>
-          <w:tcPr>
-            <w:tcW w:type="dxa" w:w="2494"/>
-          </w:tcPr>
-          <w:p>
-            <w:pPr>
-              <w:spacing w:before="40" w:after="40"/>
+              <w:spacing w:before="20" w:after="20"/>
             </w:pPr>
             <w:r>
               <w:rPr>
@@ -280,18 +218,18 @@
         </w:tc>
         <w:tc>
           <w:tcPr>
-            <w:tcW w:type="dxa" w:w="7370"/>
+            <w:tcW w:type="dxa" w:w="7937"/>
           </w:tcPr>
           <w:p>
             <w:pPr>
-              <w:spacing w:before="40" w:after="40"/>
+              <w:spacing w:before="20" w:after="20"/>
             </w:pPr>
             <w:r>
               <w:rPr>
                 <w:color w:val="1B2630"/>
                 <w:sz w:val="17"/>
               </w:rPr>
-              <w:t>De Belgische — Bouckaert e.a. 2022, al in de referentielijst.</w:t>
+              <w:t>De Belgische — Bouckaert e.a. 2022.</w:t>
             </w:r>
           </w:p>
         </w:tc>
@@ -299,47 +237,11 @@
       <w:tr>
         <w:tc>
           <w:tcPr>
-            <w:tcW w:type="dxa" w:w="2494"/>
+            <w:tcW w:type="dxa" w:w="1928"/>
           </w:tcPr>
           <w:p>
             <w:pPr>
-              <w:spacing w:before="40" w:after="40"/>
-            </w:pPr>
-            <w:r>
-              <w:rPr>
-                <w:color w:val="1B2630"/>
-                <w:sz w:val="17"/>
-              </w:rPr>
-              <w:t>Rapportering</w:t>
-            </w:r>
-          </w:p>
-        </w:tc>
-        <w:tc>
-          <w:tcPr>
-            <w:tcW w:type="dxa" w:w="7370"/>
-          </w:tcPr>
-          <w:p>
-            <w:pPr>
-              <w:spacing w:before="40" w:after="40"/>
-            </w:pPr>
-            <w:r>
-              <w:rPr>
-                <w:color w:val="1B2630"/>
-                <w:sz w:val="17"/>
-              </w:rPr>
-              <w:t>CHEERS.</w:t>
-            </w:r>
-          </w:p>
-        </w:tc>
-      </w:tr>
-      <w:tr>
-        <w:tc>
-          <w:tcPr>
-            <w:tcW w:type="dxa" w:w="2494"/>
-          </w:tcPr>
-          <w:p>
-            <w:pPr>
-              <w:spacing w:before="40" w:after="40"/>
+              <w:spacing w:before="20" w:after="20"/>
             </w:pPr>
             <w:r>
               <w:rPr>
@@ -352,18 +254,18 @@
         </w:tc>
         <w:tc>
           <w:tcPr>
-            <w:tcW w:type="dxa" w:w="7370"/>
+            <w:tcW w:type="dxa" w:w="7937"/>
           </w:tcPr>
           <w:p>
             <w:pPr>
-              <w:spacing w:before="40" w:after="40"/>
+              <w:spacing w:before="20" w:after="20"/>
             </w:pPr>
             <w:r>
               <w:rPr>
                 <w:color w:val="1B2630"/>
                 <w:sz w:val="17"/>
               </w:rPr>
-              <w:t>Deterministisch én probabilistisch, Monte Carlo met 10 000 iteraties, kosteneffectiviteitsvlak en CEAC.</w:t>
+              <w:t>DSA en PSA, 10 000 iteraties, CE-vlak en CEAC. CHEERS voor de rapportering.</w:t>
             </w:r>
           </w:p>
         </w:tc>
@@ -371,11 +273,11 @@
       <w:tr>
         <w:tc>
           <w:tcPr>
-            <w:tcW w:type="dxa" w:w="2494"/>
+            <w:tcW w:type="dxa" w:w="1928"/>
           </w:tcPr>
           <w:p>
             <w:pPr>
-              <w:spacing w:before="40" w:after="40"/>
+              <w:spacing w:before="20" w:after="20"/>
             </w:pPr>
             <w:r>
               <w:rPr>
@@ -388,18 +290,18 @@
         </w:tc>
         <w:tc>
           <w:tcPr>
-            <w:tcW w:type="dxa" w:w="7370"/>
+            <w:tcW w:type="dxa" w:w="7937"/>
           </w:tcPr>
           <w:p>
             <w:pPr>
-              <w:spacing w:before="40" w:after="40"/>
+              <w:spacing w:before="20" w:after="20"/>
             </w:pPr>
             <w:r>
               <w:rPr>
                 <w:color w:val="1B2630"/>
                 <w:sz w:val="17"/>
               </w:rPr>
-              <w:t>Markov naar vijf jaar, zes toestanden: ulcusvrij, actief ulcus, genezen, kleine amputatie, grote amputatie, overlijden.</w:t>
+              <w:t>Markov naar vijf jaar, zes toestanden.</w:t>
             </w:r>
           </w:p>
         </w:tc>
@@ -407,11 +309,11 @@
       <w:tr>
         <w:tc>
           <w:tcPr>
-            <w:tcW w:type="dxa" w:w="2494"/>
+            <w:tcW w:type="dxa" w:w="1928"/>
           </w:tcPr>
           <w:p>
             <w:pPr>
-              <w:spacing w:before="40" w:after="40"/>
+              <w:spacing w:before="20" w:after="20"/>
             </w:pPr>
             <w:r>
               <w:rPr>
@@ -424,18 +326,18 @@
         </w:tc>
         <w:tc>
           <w:tcPr>
-            <w:tcW w:type="dxa" w:w="7370"/>
+            <w:tcW w:type="dxa" w:w="7937"/>
           </w:tcPr>
           <w:p>
             <w:pPr>
-              <w:spacing w:before="40" w:after="40"/>
+              <w:spacing w:before="20" w:after="20"/>
             </w:pPr>
             <w:r>
               <w:rPr>
                 <w:color w:val="1B2630"/>
                 <w:sz w:val="17"/>
               </w:rPr>
-              <w:t>EQ-5D-5L (21), iMCQ (34), iPCQ (35) en de dagboeken (45, 45a, 45b), aangevuld met dossierextractie.</w:t>
+              <w:t>EQ-5D-5L (21), iMCQ (34), iPCQ (35), dagboeken (45/45a/45b), plus dossierextractie.</w:t>
             </w:r>
           </w:p>
         </w:tc>
@@ -443,71 +345,35 @@
       <w:tr>
         <w:tc>
           <w:tcPr>
-            <w:tcW w:type="dxa" w:w="2494"/>
+            <w:tcW w:type="dxa" w:w="1928"/>
           </w:tcPr>
           <w:p>
             <w:pPr>
-              <w:spacing w:before="40" w:after="40"/>
+              <w:spacing w:before="20" w:after="20"/>
             </w:pPr>
             <w:r>
               <w:rPr>
                 <w:color w:val="1B2630"/>
                 <w:sz w:val="17"/>
               </w:rPr>
-              <w:t>Dubbele rapportering</w:t>
+              <w:t>Kader</w:t>
             </w:r>
           </w:p>
         </w:tc>
         <w:tc>
           <w:tcPr>
-            <w:tcW w:type="dxa" w:w="7370"/>
+            <w:tcW w:type="dxa" w:w="7937"/>
           </w:tcPr>
           <w:p>
             <w:pPr>
-              <w:spacing w:before="40" w:after="40"/>
+              <w:spacing w:before="20" w:after="20"/>
             </w:pPr>
             <w:r>
               <w:rPr>
                 <w:color w:val="1B2630"/>
                 <w:sz w:val="17"/>
               </w:rPr>
-              <w:t>Kost per vermeden ulcus én kost per QALY naast elkaar — bewust, omdat die twee bij DIATEMP uiteenliepen.</w:t>
-            </w:r>
-          </w:p>
-        </w:tc>
-      </w:tr>
-      <w:tr>
-        <w:tc>
-          <w:tcPr>
-            <w:tcW w:type="dxa" w:w="2494"/>
-          </w:tcPr>
-          <w:p>
-            <w:pPr>
-              <w:spacing w:before="40" w:after="40"/>
-            </w:pPr>
-            <w:r>
-              <w:rPr>
-                <w:color w:val="1B2630"/>
-                <w:sz w:val="17"/>
-              </w:rPr>
-              <w:t>Beslissingskader</w:t>
-            </w:r>
-          </w:p>
-        </w:tc>
-        <w:tc>
-          <w:tcPr>
-            <w:tcW w:type="dxa" w:w="7370"/>
-          </w:tcPr>
-          <w:p>
-            <w:pPr>
-              <w:spacing w:before="40" w:after="40"/>
-            </w:pPr>
-            <w:r>
-              <w:rPr>
-                <w:color w:val="1B2630"/>
-                <w:sz w:val="17"/>
-              </w:rPr>
-              <w:t>Een terugbetalingsbeslissing. Schoeisel is terugbetaald, de drukmeting en de tijd om ernaar te handelen niet.</w:t>
+              <w:t>Terugbetalingsbeslissing. Schoeisel is terugbetaald, de drukmeting niet.</w:t>
             </w:r>
           </w:p>
         </w:tc>
@@ -515,7 +381,7 @@
     </w:tbl>
     <w:p>
       <w:pPr>
-        <w:spacing w:before="300" w:after="100"/>
+        <w:spacing w:before="260" w:after="80"/>
       </w:pPr>
       <w:r>
         <w:rPr>
@@ -523,26 +389,13 @@
           <w:color w:val="FF7A00"/>
           <w:sz w:val="22"/>
         </w:rPr>
-        <w:t>2  Beslist en opgelost</w:t>
+        <w:t>2  Al uitgezocht — geen overleg nodig</w:t>
       </w:r>
     </w:p>
     <w:p>
       <w:pPr>
-        <w:spacing w:after="100"/>
-      </w:pPr>
-      <w:r>
-        <w:rPr>
-          <w:b w:val="0"/>
-          <w:color w:val="5A6A78"/>
-          <w:sz w:val="17"/>
-        </w:rPr>
-        <w:t>Drie punten uit de eerdere versie die geen overleg meer nodig hebben.</w:t>
-      </w:r>
-    </w:p>
-    <w:p>
-      <w:pPr>
-        <w:spacing w:after="100"/>
-        <w:ind w:left="425" w:hanging="425"/>
+        <w:spacing w:after="80"/>
+        <w:ind w:left="397" w:hanging="397"/>
       </w:pPr>
       <w:r>
         <w:rPr>
@@ -550,7 +403,7 @@
           <w:color w:val="FF7A00"/>
           <w:sz w:val="18"/>
         </w:rPr>
-        <w:t xml:space="preserve">A.  </w:t>
+        <w:t xml:space="preserve">•  </w:t>
       </w:r>
       <w:r>
         <w:rPr>
@@ -566,13 +419,13 @@
           <w:color w:val="5A6A78"/>
           <w:sz w:val="18"/>
         </w:rPr>
-        <w:t>Beslist. Verzuim, presenteïsme en verlies aan onbetaald werk wegen genoeg op tegen de invullast.</w:t>
+        <w:t>Beslist.</w:t>
       </w:r>
     </w:p>
     <w:p>
       <w:pPr>
-        <w:spacing w:after="100"/>
-        <w:ind w:left="425" w:hanging="425"/>
+        <w:spacing w:after="80"/>
+        <w:ind w:left="397" w:hanging="397"/>
       </w:pPr>
       <w:r>
         <w:rPr>
@@ -580,7 +433,7 @@
           <w:color w:val="FF7A00"/>
           <w:sz w:val="18"/>
         </w:rPr>
-        <w:t xml:space="preserve">B.  </w:t>
+        <w:t xml:space="preserve">•  </w:t>
       </w:r>
       <w:r>
         <w:rPr>
@@ -588,7 +441,7 @@
           <w:color w:val="1B2630"/>
           <w:sz w:val="18"/>
         </w:rPr>
-        <w:t xml:space="preserve">Het Nederlandse origineel van iMCQ en iPCQ, ongewijzigd.  </w:t>
+        <w:t xml:space="preserve">Nederlands origineel van iMCQ en iPCQ, ongewijzigd.  </w:t>
       </w:r>
       <w:r>
         <w:rPr>
@@ -596,13 +449,13 @@
           <w:color w:val="5A6A78"/>
           <w:sz w:val="18"/>
         </w:rPr>
-        <w:t>Van de twintig zorgvragen is er één Nederlands-specifiek (de bedrijfsarts, hier vrijwel altijd nul). De waardering gebeurt achteraf met Belgische tarieven, dus een Nederlands etiket bederft de rekening niet. Het enige onbruikbare item is de opleidingsvraag A4 — maar de hele A-sectie dubbelt met eCRF 07, waar opleiding en werksituatie al in Belgische categorieën staan. Voorstel: A-sectie niet afnemen, rest ongewijzigd, en bij iMTA alleen gebruikstoestemming vragen.</w:t>
+        <w:t>Één item is Nederlands-specifiek (bedrijfsarts, hier bijna altijd nul). De A-sectie dubbelt met eCRF 07 en wordt niet afgenomen — iMTA staat weglaten van irrelevante modules toe. Geen Belgische versie beschikbaar.</w:t>
       </w:r>
     </w:p>
     <w:p>
       <w:pPr>
-        <w:spacing w:after="100"/>
-        <w:ind w:left="425" w:hanging="425"/>
+        <w:spacing w:after="80"/>
+        <w:ind w:left="397" w:hanging="397"/>
       </w:pPr>
       <w:r>
         <w:rPr>
@@ -610,7 +463,7 @@
           <w:color w:val="FF7A00"/>
           <w:sz w:val="18"/>
         </w:rPr>
-        <w:t xml:space="preserve">C.  </w:t>
+        <w:t xml:space="preserve">•  </w:t>
       </w:r>
       <w:r>
         <w:rPr>
@@ -618,7 +471,7 @@
           <w:color w:val="1B2630"/>
           <w:sz w:val="18"/>
         </w:rPr>
-        <w:t xml:space="preserve">De terugblikperiode van vier weken blijft ook.  </w:t>
+        <w:t xml:space="preserve">Terugblik blijft vier weken.  </w:t>
       </w:r>
       <w:r>
         <w:rPr>
@@ -626,12 +479,72 @@
           <w:color w:val="5A6A78"/>
           <w:sz w:val="18"/>
         </w:rPr>
-        <w:t>De iMTA-handleiding is hier expliciet: een lángere periode gaat ten koste van de accuraatheid van zelfgerapporteerd verzuim, met bronvermelding. En ze schrijft de oplossing zelf voor: is het interval tussen twee meetmomenten langer dan vier weken, dan worden de gegevens geëxtrapoleerd naar het werkelijke tijdsverschil. Dus niet oprekken naar drie maanden, maar vier weken houden en extrapoleren — en dat in het analyseplan zetten, met de aanname erbij dat die vier weken representatief zijn voor het kwartaal. Bij een aandoening die in episodes verloopt is dat de zwakke plek, dus die aanname hoort in de gevoeligheidsanalyse.</w:t>
+        <w:t>De iMTA-handleiding: langer gaat ten koste van de accuraatheid, en schrijft extrapolatie naar het werkelijke interval voor.</w:t>
       </w:r>
     </w:p>
     <w:p>
       <w:pPr>
-        <w:spacing w:before="300" w:after="100"/>
+        <w:spacing w:after="80"/>
+        <w:ind w:left="397" w:hanging="397"/>
+      </w:pPr>
+      <w:r>
+        <w:rPr>
+          <w:b/>
+          <w:color w:val="FF7A00"/>
+          <w:sz w:val="18"/>
+        </w:rPr>
+        <w:t xml:space="preserve">•  </w:t>
+      </w:r>
+      <w:r>
+        <w:rPr>
+          <w:b/>
+          <w:color w:val="1B2630"/>
+          <w:sz w:val="18"/>
+        </w:rPr>
+        <w:t xml:space="preserve">Telefonisch afnemen mag.  </w:t>
+      </w:r>
+      <w:r>
+        <w:rPr>
+          <w:b w:val="0"/>
+          <w:color w:val="5A6A78"/>
+          <w:sz w:val="18"/>
+        </w:rPr>
+        <w:t>Beide handleidingen staan mondelinge afname toe. Voor de EQ-5D moet wél de interviewer-administered versie opgevraagd worden — de licentie dekt ze, het bestand moet erbij.</w:t>
+      </w:r>
+    </w:p>
+    <w:p>
+      <w:pPr>
+        <w:spacing w:after="80"/>
+        <w:ind w:left="397" w:hanging="397"/>
+      </w:pPr>
+      <w:r>
+        <w:rPr>
+          <w:b/>
+          <w:color w:val="FF7A00"/>
+          <w:sz w:val="18"/>
+        </w:rPr>
+        <w:t xml:space="preserve">•  </w:t>
+      </w:r>
+      <w:r>
+        <w:rPr>
+          <w:b/>
+          <w:color w:val="1B2630"/>
+          <w:sz w:val="18"/>
+        </w:rPr>
+        <w:t xml:space="preserve">De verandering-vraag zit al in het dagboek.  </w:t>
+      </w:r>
+      <w:r>
+        <w:rPr>
+          <w:b w:val="0"/>
+          <w:color w:val="5A6A78"/>
+          <w:sz w:val="18"/>
+        </w:rPr>
+        <w:t>45b vraagt voor medicatie, thuisverpleging en thuiszorg alleen wat veranderde; consultaties, aankopen en opnames worden wel telkens genoteerd. Die grens is juist.</w:t>
+      </w:r>
+    </w:p>
+    <w:p>
+      <w:pPr>
+        <w:spacing w:before="260" w:after="80"/>
       </w:pPr>
       <w:r>
         <w:rPr>
@@ -639,12 +552,12 @@
           <w:color w:val="FF7A00"/>
           <w:sz w:val="22"/>
         </w:rPr>
-        <w:t>3  Twee gaten die de kern raken</w:t>
+        <w:t>3  Dertien vragen</w:t>
       </w:r>
     </w:p>
     <w:p>
       <w:pPr>
-        <w:spacing w:after="100"/>
+        <w:spacing w:after="80"/>
       </w:pPr>
       <w:r>
         <w:rPr>
@@ -652,13 +565,13 @@
           <w:color w:val="5A6A78"/>
           <w:sz w:val="17"/>
         </w:rPr>
-        <w:t>Deze twee zou ik als eerste op tafel leggen. Ze raken niet de analyse maar de vraag of de studie haar eigen onderzoeksvraag kán beantwoorden.</w:t>
+        <w:t>In de volgorde waarin ik ze zou stellen.</w:t>
       </w:r>
     </w:p>
     <w:p>
       <w:pPr>
-        <w:spacing w:after="100"/>
-        <w:ind w:left="425" w:hanging="425"/>
+        <w:spacing w:after="80"/>
+        <w:ind w:left="397" w:hanging="397"/>
       </w:pPr>
       <w:r>
         <w:rPr>
@@ -666,7 +579,7 @@
           <w:color w:val="FF7A00"/>
           <w:sz w:val="18"/>
         </w:rPr>
-        <w:t xml:space="preserve">1.  </w:t>
+        <w:t xml:space="preserve">1  </w:t>
       </w:r>
       <w:r>
         <w:rPr>
@@ -674,7 +587,37 @@
           <w:color w:val="1B2630"/>
           <w:sz w:val="18"/>
         </w:rPr>
-        <w:t xml:space="preserve">Niets legt de tijdsbesteding van de interventie vast.  </w:t>
+        <w:t xml:space="preserve">Wie doet de analyse, en is dat begroot?  </w:t>
+      </w:r>
+      <w:r>
+        <w:rPr>
+          <w:b w:val="0"/>
+          <w:color w:val="5A6A78"/>
+          <w:sz w:val="18"/>
+        </w:rPr>
+        <w:t>WP3 levert op maand 42. Trial-based analyse, Markov-model en het economische paper — door wie, in welke software, vanaf wanneer? Zonder antwoord landt het bij mij.</w:t>
+      </w:r>
+    </w:p>
+    <w:p>
+      <w:pPr>
+        <w:spacing w:after="80"/>
+        <w:ind w:left="397" w:hanging="397"/>
+      </w:pPr>
+      <w:r>
+        <w:rPr>
+          <w:b/>
+          <w:color w:val="FF7A00"/>
+          <w:sz w:val="18"/>
+        </w:rPr>
+        <w:t xml:space="preserve">2  </w:t>
+      </w:r>
+      <w:r>
+        <w:rPr>
+          <w:b/>
+          <w:color w:val="1B2630"/>
+          <w:sz w:val="18"/>
+        </w:rPr>
+        <w:t xml:space="preserve">Niets registreert de tijdsbesteding van de interventie.  </w:t>
       </w:r>
       <w:r>
         <w:rPr>
@@ -682,7 +625,7 @@
           <w:color w:val="1D8DB0"/>
           <w:sz w:val="18"/>
         </w:rPr>
-        <w:t xml:space="preserve">[raakt de eCRF’s]  </w:t>
+        <w:t xml:space="preserve">[eCRF]  </w:t>
       </w:r>
       <w:r>
         <w:rPr>
@@ -690,13 +633,13 @@
           <w:color w:val="5A6A78"/>
           <w:sz w:val="18"/>
         </w:rPr>
-        <w:t>De studie bestaat om te beantwoorden of de drukmeting én de klinische tijd om ernaar te handelen terugbetaald moeten worden. Maar geen enkel formulier registreert die tijd. eCRF 23, waar de iteratieve aanpassing onder drukfeedback gebeurt, heeft geen enkel tijdsveld. eCRF 24 registreert de meetresultaten, niet de minuten. eCRF 40 vraagt de therapeut wel naar tijdsbesteding, maar als globaal gemiddelde in een dagboek — bruikbaar voor de procesevaluatie, te grof voor micro-costing. Het aantal iteraties is nog af te leiden uit de extra ontlastingstests op eCRF 24, de duur niet. Zonder die gegevens moet de interventiekost uit aannames komen, en dat is precies het getal waar de terugbetalingsbeslissing op draait.</w:t>
+        <w:t>eCRF 23, waar de drukgestuurde aanpassing gebeurt, heeft geen tijdsveld. eCRF 24 registreert resultaten, niet minuten. eCRF 40 vraagt globale gemiddelden. De interventiekost moet dus uit aannames komen — en dat is het getal waar de terugbetalingsbeslissing op draait.</w:t>
       </w:r>
     </w:p>
     <w:p>
       <w:pPr>
-        <w:spacing w:after="100"/>
-        <w:ind w:left="425" w:hanging="425"/>
+        <w:spacing w:after="80"/>
+        <w:ind w:left="397" w:hanging="397"/>
       </w:pPr>
       <w:r>
         <w:rPr>
@@ -704,7 +647,7 @@
           <w:color w:val="FF7A00"/>
           <w:sz w:val="18"/>
         </w:rPr>
-        <w:t xml:space="preserve">2.  </w:t>
+        <w:t xml:space="preserve">3  </w:t>
       </w:r>
       <w:r>
         <w:rPr>
@@ -720,7 +663,7 @@
           <w:color w:val="1D8DB0"/>
           <w:sz w:val="18"/>
         </w:rPr>
-        <w:t xml:space="preserve">[raakt de eCRF’s]  </w:t>
+        <w:t xml:space="preserve">[eCRF]  </w:t>
       </w:r>
       <w:r>
         <w:rPr>
@@ -728,39 +671,13 @@
           <w:color w:val="5A6A78"/>
           <w:sz w:val="18"/>
         </w:rPr>
-        <w:t>Het manuscript belooft dat het zorggebruik aangevuld wordt met extractie uit de medische dossiers. Er is geen eCRF voor. Dat betekent zes ziekenhuizen, zes dossiersystemen, een verwerkingsgrond per centrum en iemands uren — niets daarvan is belegd. Concreet te beslissen: welke posten komen uit het dossier in plaats van uit patient report (vermoedelijk opnames, amputaties, antibiotica en wondzorg door de voetkliniek), wie extraheert, en dekt het toestemmingsformulier de dossierinzage al?</w:t>
+        <w:t>Het manuscript belooft ze. Zes ziekenhuizen, zes dossiersystemen, een verwerkingsgrond per centrum. Welke posten uit het dossier, wie extraheert, dekt het toestemmingsformulier de inzage?</w:t>
       </w:r>
     </w:p>
     <w:p>
       <w:pPr>
-        <w:spacing w:before="300" w:after="100"/>
-      </w:pPr>
-      <w:r>
-        <w:rPr>
-          <w:b/>
-          <w:color w:val="FF7A00"/>
-          <w:sz w:val="22"/>
-        </w:rPr>
-        <w:t>4  Zes diepere vragen</w:t>
-      </w:r>
-    </w:p>
-    <w:p>
-      <w:pPr>
-        <w:spacing w:after="100"/>
-      </w:pPr>
-      <w:r>
-        <w:rPr>
-          <w:b w:val="0"/>
-          <w:color w:val="5A6A78"/>
-          <w:sz w:val="17"/>
-        </w:rPr>
-        <w:t>Methodologisch, in de volgorde waarin ik ze zou stellen. De eerste raakt de eCRF’s, de rest hoort in het analyseplan van oktober.</w:t>
-      </w:r>
-    </w:p>
-    <w:p>
-      <w:pPr>
-        <w:spacing w:after="100"/>
-        <w:ind w:left="425" w:hanging="425"/>
+        <w:spacing w:after="80"/>
+        <w:ind w:left="397" w:hanging="397"/>
       </w:pPr>
       <w:r>
         <w:rPr>
@@ -768,7 +685,7 @@
           <w:color w:val="FF7A00"/>
           <w:sz w:val="18"/>
         </w:rPr>
-        <w:t xml:space="preserve">3.  </w:t>
+        <w:t xml:space="preserve">4  </w:t>
       </w:r>
       <w:r>
         <w:rPr>
@@ -776,7 +693,7 @@
           <w:color w:val="1B2630"/>
           <w:sz w:val="18"/>
         </w:rPr>
-        <w:t xml:space="preserve">Welke bron wint waar dagboek, iMCQ en dossier elkaar overlappen?  </w:t>
+        <w:t xml:space="preserve">Welke bron wint bij overlap?  </w:t>
       </w:r>
       <w:r>
         <w:rPr>
@@ -784,7 +701,7 @@
           <w:color w:val="1D8DB0"/>
           <w:sz w:val="18"/>
         </w:rPr>
-        <w:t xml:space="preserve">[raakt de eCRF’s]  </w:t>
+        <w:t xml:space="preserve">[eCRF]  </w:t>
       </w:r>
       <w:r>
         <w:rPr>
@@ -792,13 +709,13 @@
           <w:color w:val="5A6A78"/>
           <w:sz w:val="18"/>
         </w:rPr>
-        <w:t>Op de dure posten is de overlap tussen dagboek en iMCQ zo goed als volledig, en ze staan op dezelfde bezoeken. Het dagboek is prospectief en vraagt ook het remgeld in euro; de iMCQ kijkt drie maanden terug. Mijn voorstel: het dagboek is de ruggengraat, de iMCQ vult aan met wat het dagboek niet heeft — spoedgevallen, ambulance, mantelzorg in uren en vervoer — en bij tegenspraak wint het dagboek. Tweede laag: waarderen we met RIZIV-tarieven, of gebruiken we de bedragen die de deelnemer opschrijft, of beide voor verschillende posten?</w:t>
+        <w:t>Dagboek, iMCQ en dossier meten hetzelfde, op dezelfde bezoeken. Voorstel: dagboek als ruggengraat, iMCQ voor wat het dagboek mist (spoed, ambulance, mantelzorg, vervoer), dagboek wint bij tegenspraak. En: waarderen met RIZIV-tarieven of met de bedragen die de deelnemer opschrijft?</w:t>
       </w:r>
     </w:p>
     <w:p>
       <w:pPr>
-        <w:spacing w:after="100"/>
-        <w:ind w:left="425" w:hanging="425"/>
+        <w:spacing w:after="80"/>
+        <w:ind w:left="397" w:hanging="397"/>
       </w:pPr>
       <w:r>
         <w:rPr>
@@ -806,7 +723,7 @@
           <w:color w:val="FF7A00"/>
           <w:sz w:val="18"/>
         </w:rPr>
-        <w:t xml:space="preserve">4.  </w:t>
+        <w:t xml:space="preserve">5  </w:t>
       </w:r>
       <w:r>
         <w:rPr>
@@ -814,7 +731,15 @@
           <w:color w:val="1B2630"/>
           <w:sz w:val="18"/>
         </w:rPr>
-        <w:t xml:space="preserve">Mantelzorg staat op drie plaatsen. Hoe voorkomen we dubbeltelling?  </w:t>
+        <w:t xml:space="preserve">Hoort de iMCQ ook op baseline?  </w:t>
+      </w:r>
+      <w:r>
+        <w:rPr>
+          <w:b/>
+          <w:color w:val="1D8DB0"/>
+          <w:sz w:val="18"/>
+        </w:rPr>
+        <w:t xml:space="preserve">[eCRF]  </w:t>
       </w:r>
       <w:r>
         <w:rPr>
@@ -822,13 +747,13 @@
           <w:color w:val="5A6A78"/>
           <w:sz w:val="18"/>
         </w:rPr>
-        <w:t>eCRF 07 punt 1.10 vraagt of iemand mantelzorg ontvangt of verleent. iMCQ vraag 19 vraagt de werkelijk ontvangen uren per soort. iPCQ vraag 12 vraagt hoeveel uur iemand nódig zou hebben gehad om het onbetaalde werk over te nemen. De laatste twee zijn conceptueel verschillend — werkelijk versus hypothetisch — maar als de partner het huishouden écht heeft gedaan, staan dezelfde uren mogelijk in allebei. In de maatschappelijke analyse telt dat dubbel.</w:t>
+        <w:t>Nu start ze op maand 3. Zonder zorggebruik bij aanvang kunnen we niet corrigeren voor onevenwicht tussen de armen.</w:t>
       </w:r>
     </w:p>
     <w:p>
       <w:pPr>
-        <w:spacing w:after="100"/>
-        <w:ind w:left="425" w:hanging="425"/>
+        <w:spacing w:after="80"/>
+        <w:ind w:left="397" w:hanging="397"/>
       </w:pPr>
       <w:r>
         <w:rPr>
@@ -836,7 +761,7 @@
           <w:color w:val="FF7A00"/>
           <w:sz w:val="18"/>
         </w:rPr>
-        <w:t xml:space="preserve">5.  </w:t>
+        <w:t xml:space="preserve">6  </w:t>
       </w:r>
       <w:r>
         <w:rPr>
@@ -844,7 +769,7 @@
           <w:color w:val="1B2630"/>
           <w:sz w:val="18"/>
         </w:rPr>
-        <w:t xml:space="preserve">Rapporteren we de ICUR ook gestratificeerd naar therapietrouw?  </w:t>
+        <w:t xml:space="preserve">Komt er een budgetimpactanalyse?  </w:t>
       </w:r>
       <w:r>
         <w:rPr>
@@ -852,13 +777,13 @@
           <w:color w:val="5A6A78"/>
           <w:sz w:val="18"/>
         </w:rPr>
-        <w:t>Het manuscript stelt zelf vast dat DIAFOS de adherentievoorwaarde ook in het economische domein terugvond. Therapietrouw is bij ons de vooraf vastgelegde mediator van het klinische effect, met een drempel van 80%. Een betaler wil weten wat hij koopt bij reële therapietrouw, niet bij trialtherapietrouw. Zetten we die stratificatie vooraf vast, of houden we ze exploratief?</w:t>
+        <w:t>Het manuscript noemt er geen. Voor een terugbetalingsdossier vraagt het RIZIV doorgaans een BIA náást de kosteneffectiviteit; KCE 400 behandelt beide.</w:t>
       </w:r>
     </w:p>
     <w:p>
       <w:pPr>
-        <w:spacing w:after="100"/>
-        <w:ind w:left="425" w:hanging="425"/>
+        <w:spacing w:after="80"/>
+        <w:ind w:left="397" w:hanging="397"/>
       </w:pPr>
       <w:r>
         <w:rPr>
@@ -866,7 +791,7 @@
           <w:color w:val="FF7A00"/>
           <w:sz w:val="18"/>
         </w:rPr>
-        <w:t xml:space="preserve">6.  </w:t>
+        <w:t xml:space="preserve">7  </w:t>
       </w:r>
       <w:r>
         <w:rPr>
@@ -874,7 +799,7 @@
           <w:color w:val="1B2630"/>
           <w:sz w:val="18"/>
         </w:rPr>
-        <w:t xml:space="preserve">Onderzoekskosten of zorgkosten — wat betaalt de betaler straks wérkelijk?  </w:t>
+        <w:t xml:space="preserve">De economische evaluatie is niet apart gepowerd. Zeggen we dat?  </w:t>
       </w:r>
       <w:r>
         <w:rPr>
@@ -882,13 +807,13 @@
           <w:color w:val="5A6A78"/>
           <w:sz w:val="18"/>
         </w:rPr>
-        <w:t>De trialkost bevat opstartkosten die een betaler nooit ziet: zes drukmeetsystemen, de opleiding van zes centra, de leercurve, en metingen op maand 6, 12 en 18 die protocolgedreven zijn. In routinezorg meet een kliniek misschien één keer. Presenteren we naast de trialkost ook een gemodelleerde routinekost, hoe annuïteren we de apparatuur, en welke contacten schrappen we als onderzoek? Daar hoort ook de vraag bij of het tweede paar CMFO in de interventiekost zit — als Optimal Care twee paren krijgt en Usual Care één, dan leest een betaler een deel van het kostenverschil simpelweg als meer zolen.</w:t>
+        <w:t>De 144 volgen uit het klinische eindpunt en de wervingscapaciteit. Kostendata zijn scheef en variabel. Dat is aanvaardbaar, maar hoort expliciet vermeld.</w:t>
       </w:r>
     </w:p>
     <w:p>
       <w:pPr>
-        <w:spacing w:after="100"/>
-        <w:ind w:left="425" w:hanging="425"/>
+        <w:spacing w:after="80"/>
+        <w:ind w:left="397" w:hanging="397"/>
       </w:pPr>
       <w:r>
         <w:rPr>
@@ -896,7 +821,97 @@
           <w:color w:val="FF7A00"/>
           <w:sz w:val="18"/>
         </w:rPr>
-        <w:t xml:space="preserve">7.  </w:t>
+        <w:t xml:space="preserve">8  </w:t>
+      </w:r>
+      <w:r>
+        <w:rPr>
+          <w:b/>
+          <w:color w:val="1B2630"/>
+          <w:sz w:val="18"/>
+        </w:rPr>
+        <w:t xml:space="preserve">Mantelzorg staat op drie formulieren.  </w:t>
+      </w:r>
+      <w:r>
+        <w:rPr>
+          <w:b w:val="0"/>
+          <w:color w:val="5A6A78"/>
+          <w:sz w:val="18"/>
+        </w:rPr>
+        <w:t>eCRF 07 als ja/nee, iMCQ 19 als werkelijk ontvangen uren, iPCQ 12 als hypothetische vervangingsuren. De laatste twee kunnen dezelfde uren bevatten.</w:t>
+      </w:r>
+    </w:p>
+    <w:p>
+      <w:pPr>
+        <w:spacing w:after="80"/>
+        <w:ind w:left="397" w:hanging="397"/>
+      </w:pPr>
+      <w:r>
+        <w:rPr>
+          <w:b/>
+          <w:color w:val="FF7A00"/>
+          <w:sz w:val="18"/>
+        </w:rPr>
+        <w:t xml:space="preserve">9  </w:t>
+      </w:r>
+      <w:r>
+        <w:rPr>
+          <w:b/>
+          <w:color w:val="1B2630"/>
+          <w:sz w:val="18"/>
+        </w:rPr>
+        <w:t xml:space="preserve">ICUR gestratificeerd naar therapietrouw?  </w:t>
+      </w:r>
+      <w:r>
+        <w:rPr>
+          <w:b w:val="0"/>
+          <w:color w:val="5A6A78"/>
+          <w:sz w:val="18"/>
+        </w:rPr>
+        <w:t>Therapietrouw is de vooraf vastgelegde mediator, met een drempel van 80%. Een betaler wil weten wat hij koopt bij reële therapietrouw. Vooraf vastleggen of exploratief?</w:t>
+      </w:r>
+    </w:p>
+    <w:p>
+      <w:pPr>
+        <w:spacing w:after="80"/>
+        <w:ind w:left="397" w:hanging="397"/>
+      </w:pPr>
+      <w:r>
+        <w:rPr>
+          <w:b/>
+          <w:color w:val="FF7A00"/>
+          <w:sz w:val="18"/>
+        </w:rPr>
+        <w:t xml:space="preserve">10  </w:t>
+      </w:r>
+      <w:r>
+        <w:rPr>
+          <w:b/>
+          <w:color w:val="1B2630"/>
+          <w:sz w:val="18"/>
+        </w:rPr>
+        <w:t xml:space="preserve">Onderzoekskost of routinekost?  </w:t>
+      </w:r>
+      <w:r>
+        <w:rPr>
+          <w:b w:val="0"/>
+          <w:color w:val="5A6A78"/>
+          <w:sz w:val="18"/>
+        </w:rPr>
+        <w:t>De trialkost bevat zes drukmeetsystemen, opleiding, leercurve en protocolgedreven metingen. Presenteren we ook een gemodelleerde routinekost? En zit het tweede paar CMFO in de interventiekost — als Optimal Care er twee krijgt en Usual Care één, leest een betaler dat als meer zolen.</w:t>
+      </w:r>
+    </w:p>
+    <w:p>
+      <w:pPr>
+        <w:spacing w:after="80"/>
+        <w:ind w:left="397" w:hanging="397"/>
+      </w:pPr>
+      <w:r>
+        <w:rPr>
+          <w:b/>
+          <w:color w:val="FF7A00"/>
+          <w:sz w:val="18"/>
+        </w:rPr>
+        <w:t xml:space="preserve">11  </w:t>
       </w:r>
       <w:r>
         <w:rPr>
@@ -912,13 +927,13 @@
           <w:color w:val="5A6A78"/>
           <w:sz w:val="18"/>
         </w:rPr>
-        <w:t>Zes toestanden, 144 deelnemers. In grote amputatie zal er nauwelijks persoonstijd zitten, dus die utiliteiten moeten uit de literatuur komen. Trialutiliteiten en literatuurutiliteiten binnen één model mengen is een bekende bron van vertekening. Welke toestanden trialgebaseerd, welke literatuurgebaseerd, en leggen we dat vooraf vast? KCE wijst er trouwens op dat de Belgische gezondheidsenquête EQ-5D-5L-normen per leeftijd en geslacht oplevert — bruikbaar voor de leeftijdscorrectie in de extrapolatiefase.</w:t>
+        <w:t>In grote amputatie zit nauwelijks persoonstijd, dus die komen uit de literatuur. Trial- en literatuurutiliteiten mengen vertekent. Vooraf vastleggen welke waar vandaan komt.</w:t>
       </w:r>
     </w:p>
     <w:p>
       <w:pPr>
-        <w:spacing w:after="100"/>
-        <w:ind w:left="425" w:hanging="425"/>
+        <w:spacing w:after="80"/>
+        <w:ind w:left="397" w:hanging="397"/>
       </w:pPr>
       <w:r>
         <w:rPr>
@@ -926,7 +941,7 @@
           <w:color w:val="FF7A00"/>
           <w:sz w:val="18"/>
         </w:rPr>
-        <w:t xml:space="preserve">8.  </w:t>
+        <w:t xml:space="preserve">12  </w:t>
       </w:r>
       <w:r>
         <w:rPr>
@@ -934,7 +949,7 @@
           <w:color w:val="1B2630"/>
           <w:sz w:val="18"/>
         </w:rPr>
-        <w:t xml:space="preserve">Sterfte: is de melding via ongewenste voorvallen betrouwbaar genoeg?  </w:t>
+        <w:t xml:space="preserve">Sterfte via AE-melding — betrouwbaar genoeg?  </w:t>
       </w:r>
       <w:r>
         <w:rPr>
@@ -942,12 +957,42 @@
           <w:color w:val="5A6A78"/>
           <w:sz w:val="18"/>
         </w:rPr>
-        <w:t>Sterfte is hier zowel concurrerend risico voor ulcusrecidief als Markov-toestand, en in deze populatie niet verwaarloosbaar. Het manuscript zegt dat ze via de AE-rapportering wordt vastgelegd. Voor deelnemers die zich terugtrekken of uit zicht raken is dat een zwakke schakel, en voor QALY’s heb je de datum nodig. Voor het vijfjaarsmodel zijn Belgische sterftetafels plus een diabetesrisico nodig — uit welke bron?</w:t>
+        <w:t>Sterfte is hier concurrerend risico én Markov-toestand. Voor wie zich terugtrekt is AE-melding zwak, en voor QALY’s is de datum nodig. Welke bron voor de sterftetafels in het vijfjaarsmodel?</w:t>
       </w:r>
     </w:p>
     <w:p>
       <w:pPr>
-        <w:spacing w:before="300" w:after="100"/>
+        <w:spacing w:after="80"/>
+        <w:ind w:left="397" w:hanging="397"/>
+      </w:pPr>
+      <w:r>
+        <w:rPr>
+          <w:b/>
+          <w:color w:val="FF7A00"/>
+          <w:sz w:val="18"/>
+        </w:rPr>
+        <w:t xml:space="preserve">13  </w:t>
+      </w:r>
+      <w:r>
+        <w:rPr>
+          <w:b/>
+          <w:color w:val="1B2630"/>
+          <w:sz w:val="18"/>
+        </w:rPr>
+        <w:t xml:space="preserve">Wie is eerste auteur van het economische paper?  </w:t>
+      </w:r>
+      <w:r>
+        <w:rPr>
+          <w:b w:val="0"/>
+          <w:color w:val="5A6A78"/>
+          <w:sz w:val="18"/>
+        </w:rPr>
+        <w:t>MS7 en MS8 vallen op maand 42. Nu vastleggen scheelt later discussie.</w:t>
+      </w:r>
+    </w:p>
+    <w:p>
+      <w:pPr>
+        <w:spacing w:before="260" w:after="80"/>
       </w:pPr>
       <w:r>
         <w:rPr>
@@ -955,248 +1000,7 @@
           <w:color w:val="FF7A00"/>
           <w:sz w:val="22"/>
         </w:rPr>
-        <w:t>5  Telefonische afname, en de vraag naar verándering</w:t>
-      </w:r>
-    </w:p>
-    <w:p>
-      <w:pPr>
-        <w:spacing w:after="100"/>
-      </w:pPr>
-      <w:r>
-        <w:rPr>
-          <w:b w:val="0"/>
-          <w:color w:val="5A6A78"/>
-          <w:sz w:val="17"/>
-        </w:rPr>
-        <w:t>Twee voorstellen van ons, allebei nagekeken. Ze houden allebei steek, met voorwaarden.</w:t>
-      </w:r>
-    </w:p>
-    <w:p>
-      <w:pPr>
-        <w:spacing w:after="100"/>
-        <w:ind w:left="425" w:hanging="425"/>
-      </w:pPr>
-      <w:r>
-        <w:rPr>
-          <w:b/>
-          <w:color w:val="FF7A00"/>
-          <w:sz w:val="18"/>
-        </w:rPr>
-        <w:t xml:space="preserve">D.  </w:t>
-      </w:r>
-      <w:r>
-        <w:rPr>
-          <w:b/>
-          <w:color w:val="1B2630"/>
-          <w:sz w:val="18"/>
-        </w:rPr>
-        <w:t xml:space="preserve">Telefonisch afnemen kan, en het is meer dan lastenverschuiving.  </w:t>
-      </w:r>
-      <w:r>
-        <w:rPr>
-          <w:b w:val="0"/>
-          <w:color w:val="5A6A78"/>
-          <w:sz w:val="18"/>
-        </w:rPr>
-        <w:t>De iMTA-handleidingen staan het uitdrukkelijk toe: de iMCQ en de iPCQ kunnen “zowel schriftelijk als mondeling worden afgenomen”. Geen toestemmingsprobleem dus. De iPCQ-handleiding voegt er zelfs aan toe dat modules die niet relevant zijn voor de doelgroep weggelaten mogen worden — dat bevestigt meteen dat de A-sectie overslaan geen wijziging is. Het echte voordeel zit elders: een kwartaalgesprek is ook het moment waarop je het dagboek samen overloopt. Dat vangt het halflege dagboek én het kwijtgeraakte boekje op. Voorwaarde: de afnamewijze moet gelijk zijn in beide armen en over de hele looptijd. Bel je de ene wel en de andere niet, dan krijg je een systematisch meetverschil dat precies samenvalt met het kostenverschil dat je wil schatten.</w:t>
-      </w:r>
-    </w:p>
-    <w:p>
-      <w:pPr>
-        <w:spacing w:after="100"/>
-        <w:ind w:left="425" w:hanging="425"/>
-      </w:pPr>
-      <w:r>
-        <w:rPr>
-          <w:b/>
-          <w:color w:val="FF7A00"/>
-          <w:sz w:val="18"/>
-        </w:rPr>
-        <w:t xml:space="preserve">E.  </w:t>
-      </w:r>
-      <w:r>
-        <w:rPr>
-          <w:b/>
-          <w:color w:val="1B2630"/>
-          <w:sz w:val="18"/>
-        </w:rPr>
-        <w:t xml:space="preserve">Voor de EQ-5D heb je een ándere versie nodig.  </w:t>
-      </w:r>
-      <w:r>
-        <w:rPr>
-          <w:b w:val="0"/>
-          <w:color w:val="5A6A78"/>
-          <w:sz w:val="18"/>
-        </w:rPr>
-        <w:t>Hier zit de adder. Je mag de zelfinvulversie niet zomaar voorlezen aan de telefoon — dat is een andere afnamewijze. EuroQol geeft daar aparte versies voor uit: de telefoonversie is inmiddels een legacyversie en wordt vervangen door de interviewer-administered versie, die uitwisselbaar is met telefoon en face-to-face. Goed nieuws: je licentie dekt naast de zelfinvulversie ook de interviewer-, telefoon-, face-to-face- en proxyversies. Je moet het versiebestand dus alleen ópvragen. Zet dat bij de lopende aanvraag: Belgium Flemish, interviewer-administered, naast de zelfinvulversie.</w:t>
-      </w:r>
-    </w:p>
-    <w:p>
-      <w:pPr>
-        <w:spacing w:after="100"/>
-        <w:ind w:left="425" w:hanging="425"/>
-      </w:pPr>
-      <w:r>
-        <w:rPr>
-          <w:b/>
-          <w:color w:val="FF7A00"/>
-          <w:sz w:val="18"/>
-        </w:rPr>
-        <w:t xml:space="preserve">F.  </w:t>
-      </w:r>
-      <w:r>
-        <w:rPr>
-          <w:b/>
-          <w:color w:val="1B2630"/>
-          <w:sz w:val="18"/>
-        </w:rPr>
-        <w:t xml:space="preserve">De verandering-vraag doen jullie al — en de grens ligt goed.  </w:t>
-      </w:r>
-      <w:r>
-        <w:rPr>
-          <w:b w:val="0"/>
-          <w:color w:val="5A6A78"/>
-          <w:sz w:val="18"/>
-        </w:rPr>
-        <w:t>Dagboek 45b zegt het zelf: voor medicatie, thuisverpleegkundige en thuiszorgdiensten vraag je enkel wat veranderd is; consultaties, zorgcontacten, aankopen en ziekenhuisverblijf noteert de deelnemer wel telkens, “want dat zijn nieuwe gebeurtenissen in die periode”. Dat is precies de juiste grens. Verandering werkt voor staande regelingen — chronische medicatie, een vaste verpleegkundige, poetshulp — want mensen onthouden veranderingen beter dan aantallen. Maar een ulcusepisode met drie huisartscontacten en een spoedopname krijg je nooit uit “is er iets veranderd”, en dat zijn hier net de dure posten.</w:t>
-      </w:r>
-    </w:p>
-    <w:p>
-      <w:pPr>
-        <w:spacing w:after="100"/>
-        <w:ind w:left="425" w:hanging="425"/>
-      </w:pPr>
-      <w:r>
-        <w:rPr>
-          <w:b/>
-          <w:color w:val="FF7A00"/>
-          <w:sz w:val="18"/>
-        </w:rPr>
-        <w:t xml:space="preserve">G.  </w:t>
-      </w:r>
-      <w:r>
-        <w:rPr>
-          <w:b/>
-          <w:color w:val="1B2630"/>
-          <w:sz w:val="18"/>
-        </w:rPr>
-        <w:t xml:space="preserve">Maar de iMCQ spreekt die logica tegen.  </w:t>
-      </w:r>
-      <w:r>
-        <w:rPr>
-          <w:b w:val="0"/>
-          <w:color w:val="5A6A78"/>
-          <w:sz w:val="18"/>
-        </w:rPr>
-        <w:t>De iMCQ lijst medicatie (vraag 11) en thuiszorg (vraag 10) elke drie maanden opnieuw volledig op, terwijl het dagboek voor diezelfde posten zegt: alleen wat veranderd is. Wie op hetzelfde bezoek allebei invult, krijgt tegenstrijdige instructies voor dezelfde items. Dat is geen overlap meer maar een botsing van meetlogica, en het versterkt het voorstel om het dagboek de ruggengraat te maken.</w:t>
-      </w:r>
-    </w:p>
-    <w:p>
-      <w:pPr>
-        <w:spacing w:after="100"/>
-        <w:ind w:left="425" w:hanging="425"/>
-      </w:pPr>
-      <w:r>
-        <w:rPr>
-          <w:b/>
-          <w:color w:val="FF7A00"/>
-          <w:sz w:val="18"/>
-        </w:rPr>
-        <w:t xml:space="preserve">H.  </w:t>
-      </w:r>
-      <w:r>
-        <w:rPr>
-          <w:b/>
-          <w:color w:val="1B2630"/>
-          <w:sz w:val="18"/>
-        </w:rPr>
-        <w:t xml:space="preserve">Twee zwakke plekken van verandering-meten, en hoe je ze opvangt.  </w:t>
-      </w:r>
-      <w:r>
-        <w:rPr>
-          <w:b w:val="0"/>
-          <w:color w:val="5A6A78"/>
-          <w:sz w:val="18"/>
-        </w:rPr>
-        <w:t>Ten eerste: een ontbrekende golf breekt de ketting. Mist iemand het gesprek op maand 9, dan verwijst “veranderd sinds vorige keer” op maand 12 naar een onbekend niveau. Volledige opsomming is bestand tegen gaten, verandering-meten niet. Ten tweede: de baseline moet kloppen, want alles verwijst ernaar en fouten corrigeren zichzelf niet — ze lopen achttien maanden door. Opvang: houd minstens één volledige heropsomming halverwege. Zolang de iMCQ blijft, héb je die al; laat je ze vallen, bouw ze dan in op maand 9 en 18.</w:t>
-      </w:r>
-    </w:p>
-    <w:p>
-      <w:pPr>
-        <w:spacing w:before="300" w:after="100"/>
-      </w:pPr>
-      <w:r>
-        <w:rPr>
-          <w:b/>
-          <w:color w:val="FF7A00"/>
-          <w:sz w:val="22"/>
-        </w:rPr>
-        <w:t>6  Twee dingen die geen vraag zijn maar een risico</w:t>
-      </w:r>
-    </w:p>
-    <w:p>
-      <w:pPr>
-        <w:spacing w:after="100"/>
-      </w:pPr>
-      <w:r>
-        <w:rPr>
-          <w:b w:val="0"/>
-          <w:color w:val="5A6A78"/>
-          <w:sz w:val="17"/>
-        </w:rPr>
-        <w:t>Niet voor het overleg met jou als methodoloog, wel voor de uitvoering.</w:t>
-      </w:r>
-    </w:p>
-    <w:p>
-      <w:pPr>
-        <w:spacing w:after="80"/>
-      </w:pPr>
-      <w:r>
-        <w:rPr>
-          <w:b w:val="0"/>
-          <w:color w:val="1B2630"/>
-          <w:sz w:val="18"/>
-        </w:rPr>
-        <w:t>Dagboek 45b is één boekje dat de deelnemer op visite 3 meekrijgt en dat de maanden 3 tot 18 bestrijkt. Raakt het kwijt, dan is vijftien maanden kostendata weg. Er is geen terugvaloptie voorzien — bijvoorbeeld het ingevulde deel per bezoek kopiëren en op de site laten.</w:t>
-      </w:r>
-    </w:p>
-    <w:p>
-      <w:pPr>
-        <w:spacing w:after="80"/>
-      </w:pPr>
-      <w:r>
-        <w:rPr>
-          <w:b w:val="0"/>
-          <w:color w:val="1B2630"/>
-          <w:sz w:val="18"/>
-        </w:rPr>
-        <w:t>En de overzetlast: 45b heeft ongeveer negentig kostenregels per maanddeel, zes maanddelen, honderdvierenveertig deelnemers, alles centraal over te typen door het studieteam. Dat is nog niet geschat. Dit is het soort werk dat een studie stil laat vastlopen.</w:t>
-      </w:r>
-    </w:p>
-    <w:p>
-      <w:pPr>
-        <w:spacing w:before="300" w:after="100"/>
-      </w:pPr>
-      <w:r>
-        <w:rPr>
-          <w:b/>
-          <w:color w:val="FF7A00"/>
-          <w:sz w:val="22"/>
-        </w:rPr>
-        <w:t>7  Wat het manuscript vaag laat, en wat KCE 400 erover zegt</w:t>
-      </w:r>
-    </w:p>
-    <w:p>
-      <w:pPr>
-        <w:spacing w:after="100"/>
-      </w:pPr>
-      <w:r>
-        <w:rPr>
-          <w:b w:val="0"/>
-          <w:color w:val="5A6A78"/>
-          <w:sz w:val="17"/>
-        </w:rPr>
-        <w:t>Zeven plaatsen, met telkens het antwoord van de richtlijn erbij.</w:t>
+        <w:t>4  Manuscript tegenover KCE 400 (derde editie, mei 2025)</w:t>
       </w:r>
     </w:p>
     <w:tbl>
@@ -1221,12 +1025,12 @@
       <w:tr>
         <w:tc>
           <w:tcPr>
-            <w:tcW w:type="dxa" w:w="3515"/>
+            <w:tcW w:type="dxa" w:w="3175"/>
             <w:shd w:val="clear" w:fill="1D8DB0"/>
           </w:tcPr>
           <w:p>
             <w:pPr>
-              <w:spacing w:before="40" w:after="40"/>
+              <w:spacing w:before="20" w:after="20"/>
             </w:pPr>
             <w:r>
               <w:rPr>
@@ -1234,18 +1038,18 @@
                 <w:color w:val="FFFFFF"/>
                 <w:sz w:val="16"/>
               </w:rPr>
-              <w:t>WAT ER NU STAAT</w:t>
+              <w:t>WAT ER STAAT</w:t>
             </w:r>
           </w:p>
         </w:tc>
         <w:tc>
           <w:tcPr>
-            <w:tcW w:type="dxa" w:w="6350"/>
+            <w:tcW w:type="dxa" w:w="6690"/>
             <w:shd w:val="clear" w:fill="1D8DB0"/>
           </w:tcPr>
           <w:p>
             <w:pPr>
-              <w:spacing w:before="40" w:after="40"/>
+              <w:spacing w:before="20" w:after="20"/>
             </w:pPr>
             <w:r>
               <w:rPr>
@@ -1261,35 +1065,35 @@
       <w:tr>
         <w:tc>
           <w:tcPr>
-            <w:tcW w:type="dxa" w:w="3515"/>
+            <w:tcW w:type="dxa" w:w="3175"/>
           </w:tcPr>
           <w:p>
             <w:pPr>
-              <w:spacing w:before="40" w:after="40"/>
+              <w:spacing w:before="20" w:after="20"/>
             </w:pPr>
             <w:r>
               <w:rPr>
                 <w:color w:val="1B2630"/>
                 <w:sz w:val="17"/>
               </w:rPr>
-              <w:t>“discounted at rates specified in the Belgian HTA guidance”, zonder getallen</w:t>
+              <w:t>Disconto “as specified in the guidance”, zonder getallen</w:t>
             </w:r>
           </w:p>
         </w:tc>
         <w:tc>
           <w:tcPr>
-            <w:tcW w:type="dxa" w:w="6350"/>
+            <w:tcW w:type="dxa" w:w="6690"/>
           </w:tcPr>
           <w:p>
             <w:pPr>
-              <w:spacing w:before="40" w:after="40"/>
+              <w:spacing w:before="20" w:after="20"/>
             </w:pPr>
             <w:r>
               <w:rPr>
                 <w:color w:val="1B2630"/>
                 <w:sz w:val="17"/>
               </w:rPr>
-              <w:t>3% voor kosten, 1,5% voor effecten in de referentieanalyse. Plus — staat nu niet in het manuscript — verplichte scenario’s met een gelijke voet van 0%, 3% en 5%.</w:t>
+              <w:t>3% kosten, 1,5% effecten. Plus verplichte scenario’s met gelijke voet 0%, 3% en 5% — die staan er niet.</w:t>
             </w:r>
           </w:p>
         </w:tc>
@@ -1297,35 +1101,35 @@
       <w:tr>
         <w:tc>
           <w:tcPr>
-            <w:tcW w:type="dxa" w:w="3515"/>
+            <w:tcW w:type="dxa" w:w="3175"/>
           </w:tcPr>
           <w:p>
             <w:pPr>
-              <w:spacing w:before="40" w:after="40"/>
+              <w:spacing w:before="20" w:after="20"/>
             </w:pPr>
             <w:r>
               <w:rPr>
                 <w:color w:val="1B2630"/>
                 <w:sz w:val="17"/>
               </w:rPr>
-              <w:t>“valued using standard reference prices”</w:t>
+              <w:t>“standard reference prices”</w:t>
             </w:r>
           </w:p>
         </w:tc>
         <w:tc>
           <w:tcPr>
-            <w:tcW w:type="dxa" w:w="6350"/>
+            <w:tcW w:type="dxa" w:w="6690"/>
           </w:tcPr>
           <w:p>
             <w:pPr>
-              <w:spacing w:before="40" w:after="40"/>
+              <w:spacing w:before="20" w:after="20"/>
             </w:pPr>
             <w:r>
               <w:rPr>
                 <w:color w:val="1B2630"/>
                 <w:sz w:val="17"/>
               </w:rPr>
-              <w:t>Gevalideerde bronnen, expliciet benoemd. CHEERS vraagt daarnaast valuta en prijsjaar. Beide ontbreken.</w:t>
+              <w:t>Gevalideerde bron bij naam, plus valuta en prijsjaar (CHEERS). Ontbreekt.</w:t>
             </w:r>
           </w:p>
         </w:tc>
@@ -1333,11 +1137,11 @@
       <w:tr>
         <w:tc>
           <w:tcPr>
-            <w:tcW w:type="dxa" w:w="3515"/>
+            <w:tcW w:type="dxa" w:w="3175"/>
           </w:tcPr>
           <w:p>
             <w:pPr>
-              <w:spacing w:before="40" w:after="40"/>
+              <w:spacing w:before="20" w:after="20"/>
             </w:pPr>
             <w:r>
               <w:rPr>
@@ -1350,18 +1154,18 @@
         </w:tc>
         <w:tc>
           <w:tcPr>
-            <w:tcW w:type="dxa" w:w="6350"/>
+            <w:tcW w:type="dxa" w:w="6690"/>
           </w:tcPr>
           <w:p>
             <w:pPr>
-              <w:spacing w:before="40" w:after="40"/>
+              <w:spacing w:before="20" w:after="20"/>
             </w:pPr>
             <w:r>
               <w:rPr>
                 <w:color w:val="1B2630"/>
                 <w:sz w:val="17"/>
               </w:rPr>
-              <w:t>Achterhaald: er ís een Belgische EQ-5D-5L-waardeset. Schrap de clausule en noem Bouckaert e.a. 2022 rechtstreeks.</w:t>
+              <w:t>Achterhaald — er is een Belgische waardeset. Clausule schrappen.</w:t>
             </w:r>
           </w:p>
         </w:tc>
@@ -1369,35 +1173,35 @@
       <w:tr>
         <w:tc>
           <w:tcPr>
-            <w:tcW w:type="dxa" w:w="3515"/>
+            <w:tcW w:type="dxa" w:w="3175"/>
           </w:tcPr>
           <w:p>
             <w:pPr>
-              <w:spacing w:before="40" w:after="40"/>
+              <w:spacing w:before="20" w:after="20"/>
             </w:pPr>
             <w:r>
               <w:rPr>
                 <w:color w:val="1B2630"/>
                 <w:sz w:val="17"/>
               </w:rPr>
-              <w:t>Markov met zes toestanden benoemd</w:t>
+              <w:t>Markov, zes toestanden</w:t>
             </w:r>
           </w:p>
         </w:tc>
         <w:tc>
           <w:tcPr>
-            <w:tcW w:type="dxa" w:w="6350"/>
+            <w:tcW w:type="dxa" w:w="6690"/>
           </w:tcPr>
           <w:p>
             <w:pPr>
-              <w:spacing w:before="40" w:after="40"/>
+              <w:spacing w:before="20" w:after="20"/>
             </w:pPr>
             <w:r>
               <w:rPr>
                 <w:color w:val="1B2630"/>
                 <w:sz w:val="17"/>
               </w:rPr>
-              <w:t>Cyclusduur ontbreekt, half-cycle correctie ook — die wordt aanbevolen. Utiliteiten per toestand met hun bron.</w:t>
+              <w:t>Cyclusduur en half-cycle correctie ontbreken; utiliteiten met bron.</w:t>
             </w:r>
           </w:p>
         </w:tc>
@@ -1405,35 +1209,35 @@
       <w:tr>
         <w:tc>
           <w:tcPr>
-            <w:tcW w:type="dxa" w:w="3515"/>
+            <w:tcW w:type="dxa" w:w="3175"/>
           </w:tcPr>
           <w:p>
             <w:pPr>
-              <w:spacing w:before="40" w:after="40"/>
+              <w:spacing w:before="20" w:after="20"/>
             </w:pPr>
             <w:r>
               <w:rPr>
                 <w:color w:val="1B2630"/>
                 <w:sz w:val="17"/>
               </w:rPr>
-              <w:t>Horizon van vijf jaar</w:t>
+              <w:t>Horizon vijf jaar</w:t>
             </w:r>
           </w:p>
         </w:tc>
         <w:tc>
           <w:tcPr>
-            <w:tcW w:type="dxa" w:w="6350"/>
+            <w:tcW w:type="dxa" w:w="6690"/>
           </w:tcPr>
           <w:p>
             <w:pPr>
-              <w:spacing w:before="40" w:after="40"/>
+              <w:spacing w:before="20" w:after="20"/>
             </w:pPr>
             <w:r>
               <w:rPr>
                 <w:color w:val="1B2630"/>
                 <w:sz w:val="17"/>
               </w:rPr>
-              <w:t>Bij een gemodelleerde horizon moeten kórtere horizonnen als scenario gepresenteerd worden. Argumenteer waarom vijf jaar en niet levenslang.</w:t>
+              <w:t>Kortere horizonnen als scenario presenteren; motiveren waarom niet levenslang.</w:t>
             </w:r>
           </w:p>
         </w:tc>
@@ -1441,35 +1245,35 @@
       <w:tr>
         <w:tc>
           <w:tcPr>
-            <w:tcW w:type="dxa" w:w="3515"/>
+            <w:tcW w:type="dxa" w:w="3175"/>
           </w:tcPr>
           <w:p>
             <w:pPr>
-              <w:spacing w:before="40" w:after="40"/>
+              <w:spacing w:before="20" w:after="20"/>
             </w:pPr>
             <w:r>
               <w:rPr>
                 <w:color w:val="1B2630"/>
                 <w:sz w:val="17"/>
               </w:rPr>
-              <w:t>“societal perspective in the sensitivity analysis”</w:t>
+              <w:t>Maatschappelijk in gevoeligheidsanalyse</w:t>
             </w:r>
           </w:p>
         </w:tc>
         <w:tc>
           <w:tcPr>
-            <w:tcW w:type="dxa" w:w="6350"/>
+            <w:tcW w:type="dxa" w:w="6690"/>
           </w:tcPr>
           <w:p>
             <w:pPr>
-              <w:spacing w:before="40" w:after="40"/>
+              <w:spacing w:before="20" w:after="20"/>
             </w:pPr>
             <w:r>
               <w:rPr>
                 <w:color w:val="1B2630"/>
                 <w:sz w:val="17"/>
               </w:rPr>
-              <w:t>Klopt: productiviteitskosten horen niet in de referentieanalyse. Maar in de complementaire analyse moet het effect met harde data aangetoond worden.</w:t>
+              <w:t>Klopt. Maar het effect op productiviteit moet met harde data aangetoond worden.</w:t>
             </w:r>
           </w:p>
         </w:tc>
@@ -1477,11 +1281,11 @@
       <w:tr>
         <w:tc>
           <w:tcPr>
-            <w:tcW w:type="dxa" w:w="3515"/>
+            <w:tcW w:type="dxa" w:w="3175"/>
           </w:tcPr>
           <w:p>
             <w:pPr>
-              <w:spacing w:before="40" w:after="40"/>
+              <w:spacing w:before="20" w:after="20"/>
             </w:pPr>
             <w:r>
               <w:rPr>
@@ -1494,18 +1298,54 @@
         </w:tc>
         <w:tc>
           <w:tcPr>
-            <w:tcW w:type="dxa" w:w="6350"/>
+            <w:tcW w:type="dxa" w:w="6690"/>
           </w:tcPr>
           <w:p>
             <w:pPr>
-              <w:spacing w:before="40" w:after="40"/>
+              <w:spacing w:before="20" w:after="20"/>
             </w:pPr>
             <w:r>
               <w:rPr>
                 <w:color w:val="1B2630"/>
                 <w:sz w:val="17"/>
               </w:rPr>
-              <w:t>Ruimer dan vaak gedacht: overheid én privé betalers, inclusief het remgeld. Goed nieuws — de dagboeken vragen dat al.</w:t>
+              <w:t>Omvat ook het remgeld. De dagboeken vragen dat al.</w:t>
+            </w:r>
+          </w:p>
+        </w:tc>
+      </w:tr>
+      <w:tr>
+        <w:tc>
+          <w:tcPr>
+            <w:tcW w:type="dxa" w:w="3175"/>
+          </w:tcPr>
+          <w:p>
+            <w:pPr>
+              <w:spacing w:before="20" w:after="20"/>
+            </w:pPr>
+            <w:r>
+              <w:rPr>
+                <w:color w:val="1B2630"/>
+                <w:sz w:val="17"/>
+              </w:rPr>
+              <w:t>Drempelwaarde</w:t>
+            </w:r>
+          </w:p>
+        </w:tc>
+        <w:tc>
+          <w:tcPr>
+            <w:tcW w:type="dxa" w:w="6690"/>
+          </w:tcPr>
+          <w:p>
+            <w:pPr>
+              <w:spacing w:before="20" w:after="20"/>
+            </w:pPr>
+            <w:r>
+              <w:rPr>
+                <w:color w:val="1B2630"/>
+                <w:sz w:val="17"/>
+              </w:rPr>
+              <w:t>België heeft er geen. Drempels uit andere landen niet overnemen, aanpassen of indexeren.</w:t>
             </w:r>
           </w:p>
         </w:tc>
@@ -1513,7 +1353,7 @@
     </w:tbl>
     <w:p>
       <w:pPr>
-        <w:spacing w:before="300" w:after="100"/>
+        <w:spacing w:before="260" w:after="80"/>
       </w:pPr>
       <w:r>
         <w:rPr>
@@ -1521,12 +1361,12 @@
           <w:color w:val="FF7A00"/>
           <w:sz w:val="22"/>
         </w:rPr>
-        <w:t>8  Wat vóór de versie-lock beslist moet zijn</w:t>
+        <w:t>5  Volgorde</w:t>
       </w:r>
     </w:p>
     <w:p>
       <w:pPr>
-        <w:spacing w:after="80"/>
+        <w:spacing w:after="60"/>
       </w:pPr>
       <w:r>
         <w:rPr>
@@ -1534,12 +1374,12 @@
           <w:color w:val="1B2630"/>
           <w:sz w:val="18"/>
         </w:rPr>
-        <w:t>Vier punten raken de eCRF’s en de databank: de tijdsregistratie van de interventie, de dossierextractie, de bronhiërarchie voor het zorggebruik, en de vraag of de iMCQ ook op baseline hoort — want zonder zorggebruik bij aanvang kunnen we niet corrigeren voor een onevenwicht tussen de armen. Na de lock is elke wijziging een amendement dat opnieuw langs de ethische commissie moet.</w:t>
+        <w:t>Vraag 2 tot 5 raken de eCRF’s en de databank. Na de versie-lock is elke wijziging een amendement. De rest hoort in het analyseplan van oktober — samen met twee punten die hier niet als vraag staan: ontbrekende data moeten gézamenlijk voor kosten en QALY’s geïmputeerd worden, en met 24 deelnemers per centrum is de vraag of het centrum als toevallig effect in het kostenmodel hoort.</w:t>
       </w:r>
     </w:p>
     <w:p>
       <w:pPr>
-        <w:spacing w:after="80"/>
+        <w:spacing w:after="60"/>
       </w:pPr>
       <w:r>
         <w:rPr>
@@ -1547,25 +1387,12 @@
           <w:color w:val="1B2630"/>
           <w:sz w:val="18"/>
         </w:rPr>
-        <w:t>De rest — discontovoeten, drempelwaarde, mengen van utiliteiten, imputatiemodel en clustering per centrum — hoort in het analyseplan van oktober en kan wachten.</w:t>
+        <w:t>Twee uitvoeringsrisico’s, los van dit overleg: dagboek 45b is één boekje voor vijftien maanden zonder terugvaloptie, en de overzetlast van ~90 kostenregels × 6 maanddelen × 144 deelnemers is nog niet geschat.</w:t>
       </w:r>
     </w:p>
     <w:p>
       <w:pPr>
-        <w:spacing w:after="80"/>
-      </w:pPr>
-      <w:r>
-        <w:rPr>
-          <w:b w:val="0"/>
-          <w:color w:val="1B2630"/>
-          <w:sz w:val="18"/>
-        </w:rPr>
-        <w:t>Twee punten voor het analyseplan die hier niet als vraag staan maar wel beslist moeten worden: ontbrekende data moeten gézamenlijk voor kosten en QALY’s geïmputeerd worden, anders klopt de bootstrap van de gezamenlijke verdeling niet. En met 24 deelnemers per centrum en kostenvariatie tussen centra is de vraag of het centrum als toevallig effect in het kostenmodel hoort.</w:t>
-      </w:r>
-    </w:p>
-    <w:p>
-      <w:pPr>
-        <w:spacing w:before="240" w:after="0"/>
+        <w:spacing w:before="200" w:after="0"/>
       </w:pPr>
       <w:r>
         <w:rPr>
@@ -1573,12 +1400,12 @@
           <w:color w:val="5A6A78"/>
           <w:sz w:val="15"/>
         </w:rPr>
-        <w:t>Bron: eigen controle van het manuscript, de eCRF-set en instrument_event_mapping.csv op 24 september 2026. Richtlijn: KCE-rapport 400, derde editie, mei 2025 — richtlijnen 3, 9, 10, 11, 12, 14 en 16.3. Terugblikperiode: iMTA-handleiding iPCQ, paragraaf 1.3. Beschikbare versies van iMCQ en iPCQ nagekeken bij iMTA: geen Belgische of Vlaamse versie.</w:t>
+        <w:t>Bron: manuscript, eCRF-set en instrument_event_mapping.csv, nagekeken 24 september 2026. KCE-rapport 400, richtlijnen 3, 9, 10, 11, 12, 14 en 16.3. Afnamewijze en terugblik: iMTA-handleidingen iMCQ en iPCQ.</w:t>
       </w:r>
     </w:p>
     <w:sectPr>
       <w:pgSz w:w="12240" w:h="15840"/>
-      <w:pgMar w:top="907" w:right="1020" w:bottom="907" w:left="1020" w:header="720" w:footer="720" w:gutter="0"/>
+      <w:pgMar w:top="850" w:right="1020" w:bottom="850" w:left="1020" w:header="720" w:footer="720" w:gutter="0"/>
       <w:cols w:space="720"/>
       <w:docGrid w:linePitch="360"/>
     </w:sectPr>

</xml_diff>

<commit_message>
Overlegdocument: laatste nalezing voor de meeting
Twee inhoudelijke correcties en twee opmaakfouten:

- De inleiding zei nieuw sinds vorige week, maar de vorige versies zijn van
  gisteren. Geherformuleerd zonder tijdsverwijzing.
- De budgetimpactanalyse stond als beslist dat ze er komt, in een document voor
  degene die ze moet maken. Nu als voorstel om ze toe te voegen.
- Een onzichtbaar zacht afbreekstreepje in opnamegraad verwijderd.
- De lege hoekcel van de vergelijkingstabel heet nu ASPECT.

Co-Authored-By: Claude Opus 5 <noreply@anthropic.com>
</commit_message>
<xml_diff>
--- a/PARADISE_overleg_gezondheidseconomie.docx
+++ b/PARADISE_overleg_gezondheidseconomie.docx
@@ -51,7 +51,7 @@
           <w:color w:val="1B2630"/>
           <w:sz w:val="19"/>
         </w:rPr>
-        <w:t>Het meeste staat al in de taakverdeling, toegewezen aan jou en Maaike met een deadline. Sectie 1 is dus een stand van zaken, geen vragenlijst. Nieuw sinds vorige week: de budgetimpactanalyse is beslist (sectie 2), en daarmee komt de powervraag op tafel (sectie 3).</w:t>
+        <w:t>Het meeste staat al in de taakverdeling, toegewezen aan jou en Maaike met een deadline. Sectie 1 is dus een stand van zaken, geen vragenlijst. Sectie 2 is een voorstel: een budgetimpactanalyse toevoegen, met in sectie 3 wat dat voor de powervraag betekent.</w:t>
       </w:r>
     </w:p>
     <w:p>
@@ -528,7 +528,7 @@
           <w:color w:val="FF7A00"/>
           <w:sz w:val="22"/>
         </w:rPr>
-        <w:t>2  Budgetimpactanalyse — beslist dat ze er komt</w:t>
+        <w:t>2  Budgetimpactanalyse — voorstel om ze toe te voegen</w:t>
       </w:r>
     </w:p>
     <w:p>
@@ -580,6 +580,7 @@
                 <w:color w:val="FFFFFF"/>
                 <w:sz w:val="16"/>
               </w:rPr>
+              <w:t>ASPECT</w:t>
             </w:r>
           </w:p>
         </w:tc>
@@ -988,7 +989,7 @@
                 <w:color w:val="1B2630"/>
                 <w:sz w:val="17"/>
               </w:rPr>
-              <w:t>Deterministisch, met best- en worst-case voor variabelen zonder onderbouwing — opname­graad is het voorbeeld dat de richtlijn geeft</w:t>
+              <w:t>Deterministisch, met best- en worst-case voor variabelen zonder onderbouwing — opnamegraad is het voorbeeld dat de richtlijn geeft</w:t>
             </w:r>
           </w:p>
         </w:tc>

</xml_diff>

<commit_message>
Overlegdocument ingekort tot een pagina bespreekpunten
Op vraag: geen lange teksten meer, alleen korte punten om te bespreken. Elf punten
in drie groepen (voorstel, beslissen voor de versie-lock, analyseplan) plus drie
regels ter info. Ongeveer 180 woorden.

Co-Authored-By: Claude Opus 5.5 <noreply@anthropic.com>
</commit_message>
<xml_diff>
--- a/PARADISE_overleg_gezondheidseconomie.docx
+++ b/PARADISE_overleg_gezondheidseconomie.docx
@@ -4,7 +4,7 @@
   <w:body>
     <w:p>
       <w:pPr>
-        <w:spacing w:after="0"/>
+        <w:spacing w:before="0" w:after="40"/>
       </w:pPr>
       <w:r>
         <w:rPr>
@@ -17,20 +17,20 @@
     </w:p>
     <w:p>
       <w:pPr>
-        <w:spacing w:after="40"/>
+        <w:spacing w:before="0" w:after="20"/>
       </w:pPr>
       <w:r>
         <w:rPr>
           <w:b/>
           <w:color w:val="00407A"/>
-          <w:sz w:val="36"/>
+          <w:sz w:val="32"/>
         </w:rPr>
-        <w:t>Gezondheidseconomie — overleg Koen Putman</w:t>
+        <w:t>Overleg Koen Putman — gezondheidseconomie</w:t>
       </w:r>
     </w:p>
     <w:p>
       <w:pPr>
-        <w:spacing w:after="140"/>
+        <w:spacing w:before="0" w:after="80"/>
       </w:pPr>
       <w:r>
         <w:rPr>
@@ -38,25 +38,12 @@
           <w:color w:val="5A6A78"/>
           <w:sz w:val="18"/>
         </w:rPr>
-        <w:t>24 september 2026  ·  werkdocument</w:t>
+        <w:t>24 september 2026</w:t>
       </w:r>
     </w:p>
     <w:p>
       <w:pPr>
-        <w:spacing w:after="100"/>
-      </w:pPr>
-      <w:r>
-        <w:rPr>
-          <w:b w:val="0"/>
-          <w:color w:val="1B2630"/>
-          <w:sz w:val="19"/>
-        </w:rPr>
-        <w:t>Het meeste staat al in de taakverdeling, toegewezen aan jou en Maaike met een deadline. Sectie 1 is dus een stand van zaken, geen vragenlijst. Sectie 2 is een voorstel: een budgetimpactanalyse toevoegen, met in sectie 3 wat dat voor de powervraag betekent.</w:t>
-      </w:r>
-    </w:p>
-    <w:p>
-      <w:pPr>
-        <w:spacing w:before="260" w:after="80"/>
+        <w:spacing w:before="240" w:after="80"/>
       </w:pPr>
       <w:r>
         <w:rPr>
@@ -64,463 +51,72 @@
           <w:color w:val="FF7A00"/>
           <w:sz w:val="22"/>
         </w:rPr>
-        <w:t>1  Al toegewezen — wat ik erover vond</w:t>
+        <w:t>Voorstel</w:t>
       </w:r>
     </w:p>
-    <w:tbl>
-      <w:tblPr>
-        <w:tblW w:type="auto" w:w="0"/>
-        <w:jc w:val="left"/>
-        <w:tblLayout w:type="fixed"/>
-        <w:tblLook w:firstColumn="1" w:firstRow="1" w:lastColumn="0" w:lastRow="0" w:noHBand="0" w:noVBand="1" w:val="04A0"/>
-        <w:tblBorders>
-          <w:top w:val="single" w:sz="4" w:color="D8E2EA"/>
-          <w:left w:val="single" w:sz="4" w:color="D8E2EA"/>
-          <w:bottom w:val="single" w:sz="4" w:color="D8E2EA"/>
-          <w:right w:val="single" w:sz="4" w:color="D8E2EA"/>
-          <w:insideH w:val="single" w:sz="4" w:color="D8E2EA"/>
-          <w:insideV w:val="single" w:sz="4" w:color="D8E2EA"/>
-        </w:tblBorders>
-      </w:tblPr>
-      <w:tblGrid>
-        <w:gridCol w:w="3400"/>
-        <w:gridCol w:w="3400"/>
-        <w:gridCol w:w="3400"/>
-      </w:tblGrid>
-      <w:tr>
-        <w:tc>
-          <w:tcPr>
-            <w:tcW w:type="dxa" w:w="2608"/>
-            <w:shd w:val="clear" w:fill="1D8DB0"/>
-          </w:tcPr>
-          <w:p>
-            <w:pPr>
-              <w:spacing w:before="20" w:after="20"/>
-            </w:pPr>
-            <w:r>
-              <w:rPr>
-                <w:b/>
-                <w:color w:val="FFFFFF"/>
-                <w:sz w:val="16"/>
-              </w:rPr>
-              <w:t>TAAK</w:t>
-            </w:r>
-          </w:p>
-        </w:tc>
-        <w:tc>
-          <w:tcPr>
-            <w:tcW w:type="dxa" w:w="850"/>
-            <w:shd w:val="clear" w:fill="1D8DB0"/>
-          </w:tcPr>
-          <w:p>
-            <w:pPr>
-              <w:spacing w:before="20" w:after="20"/>
-            </w:pPr>
-            <w:r>
-              <w:rPr>
-                <w:b/>
-                <w:color w:val="FFFFFF"/>
-                <w:sz w:val="16"/>
-              </w:rPr>
-              <w:t>TEGEN</w:t>
-            </w:r>
-          </w:p>
-        </w:tc>
-        <w:tc>
-          <w:tcPr>
-            <w:tcW w:type="dxa" w:w="6406"/>
-            <w:shd w:val="clear" w:fill="1D8DB0"/>
-          </w:tcPr>
-          <w:p>
-            <w:pPr>
-              <w:spacing w:before="20" w:after="20"/>
-            </w:pPr>
-            <w:r>
-              <w:rPr>
-                <w:b/>
-                <w:color w:val="FFFFFF"/>
-                <w:sz w:val="16"/>
-              </w:rPr>
-              <w:t>WAT IK VOND</w:t>
-            </w:r>
-          </w:p>
-        </w:tc>
-      </w:tr>
-      <w:tr>
-        <w:tc>
-          <w:tcPr>
-            <w:tcW w:type="dxa" w:w="2608"/>
-          </w:tcPr>
-          <w:p>
-            <w:pPr>
-              <w:spacing w:before="20" w:after="20"/>
-            </w:pPr>
-            <w:r>
-              <w:rPr>
-                <w:color w:val="1B2630"/>
-                <w:sz w:val="17"/>
-              </w:rPr>
-              <w:t>Eenheidsprijzen en microkosten van de interventie</w:t>
-            </w:r>
-          </w:p>
-        </w:tc>
-        <w:tc>
-          <w:tcPr>
-            <w:tcW w:type="dxa" w:w="850"/>
-          </w:tcPr>
-          <w:p>
-            <w:pPr>
-              <w:spacing w:before="20" w:after="20"/>
-            </w:pPr>
-            <w:r>
-              <w:rPr>
-                <w:color w:val="1B2630"/>
-                <w:sz w:val="17"/>
-              </w:rPr>
-              <w:t>nov 26</w:t>
-            </w:r>
-          </w:p>
-        </w:tc>
-        <w:tc>
-          <w:tcPr>
-            <w:tcW w:type="dxa" w:w="6406"/>
-          </w:tcPr>
-          <w:p>
-            <w:pPr>
-              <w:spacing w:before="20" w:after="20"/>
-            </w:pPr>
-            <w:r>
-              <w:rPr>
-                <w:color w:val="1B2630"/>
-                <w:sz w:val="17"/>
-              </w:rPr>
-              <w:t>eCRF 23, waar de drukgestuurde aanpassing gebeurt, heeft geen tijdsveld. Het therapeutendagboek 40 vraagt wél naar tijd, maar als globaal gemiddelde per patiënt, niet per sessie. Voor micro-costing te grof.</w:t>
-            </w:r>
-          </w:p>
-        </w:tc>
-      </w:tr>
-      <w:tr>
-        <w:tc>
-          <w:tcPr>
-            <w:tcW w:type="dxa" w:w="2608"/>
-          </w:tcPr>
-          <w:p>
-            <w:pPr>
-              <w:spacing w:before="20" w:after="20"/>
-            </w:pPr>
-            <w:r>
-              <w:rPr>
-                <w:color w:val="1B2630"/>
-                <w:sz w:val="17"/>
-              </w:rPr>
-              <w:t>Formulier dossierextractie ulcuskosten</w:t>
-            </w:r>
-          </w:p>
-        </w:tc>
-        <w:tc>
-          <w:tcPr>
-            <w:tcW w:type="dxa" w:w="850"/>
-          </w:tcPr>
-          <w:p>
-            <w:pPr>
-              <w:spacing w:before="20" w:after="20"/>
-            </w:pPr>
-            <w:r>
-              <w:rPr>
-                <w:color w:val="1B2630"/>
-                <w:sz w:val="17"/>
-              </w:rPr>
-              <w:t>dec 26</w:t>
-            </w:r>
-          </w:p>
-        </w:tc>
-        <w:tc>
-          <w:tcPr>
-            <w:tcW w:type="dxa" w:w="6406"/>
-          </w:tcPr>
-          <w:p>
-            <w:pPr>
-              <w:spacing w:before="20" w:after="20"/>
-            </w:pPr>
-            <w:r>
-              <w:rPr>
-                <w:color w:val="1B2630"/>
-                <w:sz w:val="17"/>
-              </w:rPr>
-              <w:t>Het protocol béschrijft de extractie, maar met “where feasible” — dat is geen procedure. Zes ziekenhuizen, zes dossiersystemen.</w:t>
-            </w:r>
-          </w:p>
-        </w:tc>
-      </w:tr>
-      <w:tr>
-        <w:tc>
-          <w:tcPr>
-            <w:tcW w:type="dxa" w:w="2608"/>
-          </w:tcPr>
-          <w:p>
-            <w:pPr>
-              <w:spacing w:before="20" w:after="20"/>
-            </w:pPr>
-            <w:r>
-              <w:rPr>
-                <w:color w:val="1B2630"/>
-                <w:sz w:val="17"/>
-              </w:rPr>
-              <w:t>Dagboeklast toetsen naast de iMCQ</w:t>
-            </w:r>
-          </w:p>
-        </w:tc>
-        <w:tc>
-          <w:tcPr>
-            <w:tcW w:type="dxa" w:w="850"/>
-          </w:tcPr>
-          <w:p>
-            <w:pPr>
-              <w:spacing w:before="20" w:after="20"/>
-            </w:pPr>
-            <w:r>
-              <w:rPr>
-                <w:color w:val="1B2630"/>
-                <w:sz w:val="17"/>
-              </w:rPr>
-              <w:t>nov 26</w:t>
-            </w:r>
-          </w:p>
-        </w:tc>
-        <w:tc>
-          <w:tcPr>
-            <w:tcW w:type="dxa" w:w="6406"/>
-          </w:tcPr>
-          <w:p>
-            <w:pPr>
-              <w:spacing w:before="20" w:after="20"/>
-            </w:pPr>
-            <w:r>
-              <w:rPr>
-                <w:color w:val="1B2630"/>
-                <w:sz w:val="17"/>
-              </w:rPr>
-              <w:t>Item voor item vergeleken: op de dure posten is de overlap zo goed als volledig. Maar de iMCQ heeft spoed, ambulance, mantelzorg en vervoer die het dagboek mist; het dagboek heeft voetzorgmateriaal, remgeld en prospectieve registratie die de iMCQ mist. Geen van beide is zonder verlies te schrappen.</w:t>
-            </w:r>
-          </w:p>
-        </w:tc>
-      </w:tr>
-      <w:tr>
-        <w:tc>
-          <w:tcPr>
-            <w:tcW w:type="dxa" w:w="2608"/>
-          </w:tcPr>
-          <w:p>
-            <w:pPr>
-              <w:spacing w:before="20" w:after="20"/>
-            </w:pPr>
-            <w:r>
-              <w:rPr>
-                <w:color w:val="1B2630"/>
-                <w:sz w:val="17"/>
-              </w:rPr>
-              <w:t>Gezondheidseconomisch analyseplan</w:t>
-            </w:r>
-          </w:p>
-        </w:tc>
-        <w:tc>
-          <w:tcPr>
-            <w:tcW w:type="dxa" w:w="850"/>
-          </w:tcPr>
-          <w:p>
-            <w:pPr>
-              <w:spacing w:before="20" w:after="20"/>
-            </w:pPr>
-            <w:r>
-              <w:rPr>
-                <w:color w:val="1B2630"/>
-                <w:sz w:val="17"/>
-              </w:rPr>
-              <w:t>dec 26</w:t>
-            </w:r>
-          </w:p>
-        </w:tc>
-        <w:tc>
-          <w:tcPr>
-            <w:tcW w:type="dxa" w:w="6406"/>
-          </w:tcPr>
-          <w:p>
-            <w:pPr>
-              <w:spacing w:before="20" w:after="20"/>
-            </w:pPr>
-            <w:r>
-              <w:rPr>
-                <w:color w:val="1B2630"/>
-                <w:sz w:val="17"/>
-              </w:rPr>
-              <w:t>Zie sectie 5: acht plaatsen waar het manuscript vaag blijft, met telkens wat KCE 400 vraagt.</w:t>
-            </w:r>
-          </w:p>
-        </w:tc>
-      </w:tr>
-      <w:tr>
-        <w:tc>
-          <w:tcPr>
-            <w:tcW w:type="dxa" w:w="2608"/>
-          </w:tcPr>
-          <w:p>
-            <w:pPr>
-              <w:spacing w:before="20" w:after="20"/>
-            </w:pPr>
-            <w:r>
-              <w:rPr>
-                <w:color w:val="1B2630"/>
-                <w:sz w:val="17"/>
-              </w:rPr>
-              <w:t>Markov: structuur en parameters</w:t>
-            </w:r>
-          </w:p>
-        </w:tc>
-        <w:tc>
-          <w:tcPr>
-            <w:tcW w:type="dxa" w:w="850"/>
-          </w:tcPr>
-          <w:p>
-            <w:pPr>
-              <w:spacing w:before="20" w:after="20"/>
-            </w:pPr>
-            <w:r>
-              <w:rPr>
-                <w:color w:val="1B2630"/>
-                <w:sz w:val="17"/>
-              </w:rPr>
-              <w:t>na de start</w:t>
-            </w:r>
-          </w:p>
-        </w:tc>
-        <w:tc>
-          <w:tcPr>
-            <w:tcW w:type="dxa" w:w="6406"/>
-          </w:tcPr>
-          <w:p>
-            <w:pPr>
-              <w:spacing w:before="20" w:after="20"/>
-            </w:pPr>
-            <w:r>
-              <w:rPr>
-                <w:color w:val="1B2630"/>
-                <w:sz w:val="17"/>
-              </w:rPr>
-              <w:t>Naast de transitiekansen ontbreken de utiliteiten per toestand. In grote amputatie zal te weinig persoonstijd zitten om ze uit de trial te halen.</w:t>
-            </w:r>
-          </w:p>
-        </w:tc>
-      </w:tr>
-      <w:tr>
-        <w:tc>
-          <w:tcPr>
-            <w:tcW w:type="dxa" w:w="2608"/>
-          </w:tcPr>
-          <w:p>
-            <w:pPr>
-              <w:spacing w:before="20" w:after="20"/>
-            </w:pPr>
-            <w:r>
-              <w:rPr>
-                <w:color w:val="1B2630"/>
-                <w:sz w:val="17"/>
-              </w:rPr>
-              <w:t>Veldwerk WP2 en WP3 — tweede doctoraatsplaats</w:t>
-            </w:r>
-          </w:p>
-        </w:tc>
-        <w:tc>
-          <w:tcPr>
-            <w:tcW w:type="dxa" w:w="850"/>
-          </w:tcPr>
-          <w:p>
-            <w:pPr>
-              <w:spacing w:before="20" w:after="20"/>
-            </w:pPr>
-            <w:r>
-              <w:rPr>
-                <w:color w:val="1B2630"/>
-                <w:sz w:val="17"/>
-              </w:rPr>
-              <w:t>okt 26</w:t>
-            </w:r>
-          </w:p>
-        </w:tc>
-        <w:tc>
-          <w:tcPr>
-            <w:tcW w:type="dxa" w:w="6406"/>
-          </w:tcPr>
-          <w:p>
-            <w:pPr>
-              <w:spacing w:before="20" w:after="20"/>
-            </w:pPr>
-            <w:r>
-              <w:rPr>
-                <w:color w:val="1B2630"/>
-                <w:sz w:val="17"/>
-              </w:rPr>
-              <w:t>Telefonische afname zou 144 × 6 = 864 gesprekken toevoegen, ruwweg 300 tot 580 uur, bovenop de circa 1 900 dagboekjes die centraal overgetypt worden.</w:t>
-            </w:r>
-          </w:p>
-        </w:tc>
-      </w:tr>
-      <w:tr>
-        <w:tc>
-          <w:tcPr>
-            <w:tcW w:type="dxa" w:w="2608"/>
-          </w:tcPr>
-          <w:p>
-            <w:pPr>
-              <w:spacing w:before="20" w:after="20"/>
-            </w:pPr>
-            <w:r>
-              <w:rPr>
-                <w:color w:val="1B2630"/>
-                <w:sz w:val="17"/>
-              </w:rPr>
-              <w:t>Licenties EuroQol en iMTA</w:t>
-            </w:r>
-          </w:p>
-        </w:tc>
-        <w:tc>
-          <w:tcPr>
-            <w:tcW w:type="dxa" w:w="850"/>
-          </w:tcPr>
-          <w:p>
-            <w:pPr>
-              <w:spacing w:before="20" w:after="20"/>
-            </w:pPr>
-            <w:r>
-              <w:rPr>
-                <w:color w:val="1B2630"/>
-                <w:sz w:val="17"/>
-              </w:rPr>
-              <w:t>okt 26</w:t>
-            </w:r>
-          </w:p>
-        </w:tc>
-        <w:tc>
-          <w:tcPr>
-            <w:tcW w:type="dxa" w:w="6406"/>
-          </w:tcPr>
-          <w:p>
-            <w:pPr>
-              <w:spacing w:before="20" w:after="20"/>
-            </w:pPr>
-            <w:r>
-              <w:rPr>
-                <w:color w:val="1B2630"/>
-                <w:sz w:val="17"/>
-              </w:rPr>
-              <w:t>EuroQol geregistreerd, Belgium Flemish aangevraagd. iMTA nog te doen. Bij telefonische afname moet de interviewer-administered EQ-5D bijgevraagd worden.</w:t>
-            </w:r>
-          </w:p>
-        </w:tc>
-      </w:tr>
-    </w:tbl>
     <w:p>
       <w:pPr>
-        <w:spacing w:before="260" w:after="80"/>
+        <w:spacing w:after="60"/>
+        <w:ind w:left="340" w:hanging="340"/>
+      </w:pPr>
+      <w:r>
+        <w:rPr>
+          <w:b/>
+          <w:color w:val="FF7A00"/>
+          <w:sz w:val="20"/>
+        </w:rPr>
+        <w:t xml:space="preserve">1  </w:t>
+      </w:r>
+      <w:r>
+        <w:rPr>
+          <w:b/>
+          <w:color w:val="1B2630"/>
+          <w:sz w:val="20"/>
+        </w:rPr>
+        <w:t>Budgetimpactanalyse toevoegen</w:t>
+      </w:r>
+      <w:r>
+        <w:rPr>
+          <w:b w:val="0"/>
+          <w:color w:val="5A6A78"/>
+          <w:sz w:val="20"/>
+        </w:rPr>
+        <w:t xml:space="preserve">  — staat nergens; RIZIV vraagt ze naast de ICUR. Twee paren vs. één = aparte budgetregel</w:t>
+      </w:r>
+    </w:p>
+    <w:p>
+      <w:pPr>
+        <w:spacing w:after="60"/>
+        <w:ind w:left="340" w:hanging="340"/>
+      </w:pPr>
+      <w:r>
+        <w:rPr>
+          <w:b/>
+          <w:color w:val="FF7A00"/>
+          <w:sz w:val="20"/>
+        </w:rPr>
+        <w:t xml:space="preserve">2  </w:t>
+      </w:r>
+      <w:r>
+        <w:rPr>
+          <w:b/>
+          <w:color w:val="1B2630"/>
+          <w:sz w:val="20"/>
+        </w:rPr>
+        <w:t>Vermelden dat de economische evaluatie niet apart gepowerd is</w:t>
+      </w:r>
+      <w:r>
+        <w:rPr>
+          <w:b w:val="0"/>
+          <w:color w:val="5A6A78"/>
+          <w:sz w:val="20"/>
+        </w:rPr>
+        <w:t xml:space="preserve">  — 144 blijft; precisie-uitspraak op basis van DIATEMP</w:t>
+      </w:r>
+    </w:p>
+    <w:p>
+      <w:pPr>
+        <w:spacing w:before="240" w:after="80"/>
       </w:pPr>
       <w:r>
         <w:rPr>
@@ -528,555 +124,124 @@
           <w:color w:val="FF7A00"/>
           <w:sz w:val="22"/>
         </w:rPr>
-        <w:t>2  Budgetimpactanalyse — voorstel om ze toe te voegen</w:t>
-      </w:r>
-    </w:p>
-    <w:p>
-      <w:pPr>
-        <w:spacing w:after="80"/>
-      </w:pPr>
-      <w:r>
-        <w:rPr>
-          <w:b w:val="0"/>
-          <w:color w:val="5A6A78"/>
-          <w:sz w:val="17"/>
-        </w:rPr>
-        <w:t>KCE 400 behandelt ze in richtlijnen 17 tot 25. Ze is geen tweede kosteneffectiviteit met andere getallen, maar een ander soort analyse.</w:t>
-      </w:r>
-    </w:p>
-    <w:tbl>
-      <w:tblPr>
-        <w:tblW w:type="auto" w:w="0"/>
-        <w:jc w:val="left"/>
-        <w:tblLayout w:type="fixed"/>
-        <w:tblLook w:firstColumn="1" w:firstRow="1" w:lastColumn="0" w:lastRow="0" w:noHBand="0" w:noVBand="1" w:val="04A0"/>
-        <w:tblBorders>
-          <w:top w:val="single" w:sz="4" w:color="D8E2EA"/>
-          <w:left w:val="single" w:sz="4" w:color="D8E2EA"/>
-          <w:bottom w:val="single" w:sz="4" w:color="D8E2EA"/>
-          <w:right w:val="single" w:sz="4" w:color="D8E2EA"/>
-          <w:insideH w:val="single" w:sz="4" w:color="D8E2EA"/>
-          <w:insideV w:val="single" w:sz="4" w:color="D8E2EA"/>
-        </w:tblBorders>
-      </w:tblPr>
-      <w:tblGrid>
-        <w:gridCol w:w="3400"/>
-        <w:gridCol w:w="3400"/>
-        <w:gridCol w:w="3400"/>
-      </w:tblGrid>
-      <w:tr>
-        <w:tc>
-          <w:tcPr>
-            <w:tcW w:type="dxa" w:w="1587"/>
-            <w:shd w:val="clear" w:fill="1D8DB0"/>
-          </w:tcPr>
-          <w:p>
-            <w:pPr>
-              <w:spacing w:before="20" w:after="20"/>
-            </w:pPr>
-            <w:r>
-              <w:rPr>
-                <w:b/>
-                <w:color w:val="FFFFFF"/>
-                <w:sz w:val="16"/>
-              </w:rPr>
-              <w:t>ASPECT</w:t>
-            </w:r>
-          </w:p>
-        </w:tc>
-        <w:tc>
-          <w:tcPr>
-            <w:tcW w:type="dxa" w:w="3628"/>
-            <w:shd w:val="clear" w:fill="1D8DB0"/>
-          </w:tcPr>
-          <w:p>
-            <w:pPr>
-              <w:spacing w:before="20" w:after="20"/>
-            </w:pPr>
-            <w:r>
-              <w:rPr>
-                <w:b/>
-                <w:color w:val="FFFFFF"/>
-                <w:sz w:val="16"/>
-              </w:rPr>
-              <w:t>KOSTENEFFECTIVITEIT</w:t>
-            </w:r>
-          </w:p>
-        </w:tc>
-        <w:tc>
-          <w:tcPr>
-            <w:tcW w:type="dxa" w:w="4649"/>
-            <w:shd w:val="clear" w:fill="1D8DB0"/>
-          </w:tcPr>
-          <w:p>
-            <w:pPr>
-              <w:spacing w:before="20" w:after="20"/>
-            </w:pPr>
-            <w:r>
-              <w:rPr>
-                <w:b/>
-                <w:color w:val="FFFFFF"/>
-                <w:sz w:val="16"/>
-              </w:rPr>
-              <w:t>BUDGETIMPACT</w:t>
-            </w:r>
-          </w:p>
-        </w:tc>
-      </w:tr>
-      <w:tr>
-        <w:tc>
-          <w:tcPr>
-            <w:tcW w:type="dxa" w:w="1587"/>
-          </w:tcPr>
-          <w:p>
-            <w:pPr>
-              <w:spacing w:before="20" w:after="20"/>
-            </w:pPr>
-            <w:r>
-              <w:rPr>
-                <w:color w:val="1B2630"/>
-                <w:sz w:val="17"/>
-              </w:rPr>
-              <w:t>Vraag</w:t>
-            </w:r>
-          </w:p>
-        </w:tc>
-        <w:tc>
-          <w:tcPr>
-            <w:tcW w:type="dxa" w:w="3628"/>
-          </w:tcPr>
-          <w:p>
-            <w:pPr>
-              <w:spacing w:before="20" w:after="20"/>
-            </w:pPr>
-            <w:r>
-              <w:rPr>
-                <w:color w:val="1B2630"/>
-                <w:sz w:val="17"/>
-              </w:rPr>
-              <w:t>Is het de moeite waard?</w:t>
-            </w:r>
-          </w:p>
-        </w:tc>
-        <w:tc>
-          <w:tcPr>
-            <w:tcW w:type="dxa" w:w="4649"/>
-          </w:tcPr>
-          <w:p>
-            <w:pPr>
-              <w:spacing w:before="20" w:after="20"/>
-            </w:pPr>
-            <w:r>
-              <w:rPr>
-                <w:color w:val="1B2630"/>
-                <w:sz w:val="17"/>
-              </w:rPr>
-              <w:t>Kunnen we het betalen?</w:t>
-            </w:r>
-          </w:p>
-        </w:tc>
-      </w:tr>
-      <w:tr>
-        <w:tc>
-          <w:tcPr>
-            <w:tcW w:type="dxa" w:w="1587"/>
-          </w:tcPr>
-          <w:p>
-            <w:pPr>
-              <w:spacing w:before="20" w:after="20"/>
-            </w:pPr>
-            <w:r>
-              <w:rPr>
-                <w:color w:val="1B2630"/>
-                <w:sz w:val="17"/>
-              </w:rPr>
-              <w:t>Doelpopulatie</w:t>
-            </w:r>
-          </w:p>
-        </w:tc>
-        <w:tc>
-          <w:tcPr>
-            <w:tcW w:type="dxa" w:w="3628"/>
-          </w:tcPr>
-          <w:p>
-            <w:pPr>
-              <w:spacing w:before="20" w:after="20"/>
-            </w:pPr>
-            <w:r>
-              <w:rPr>
-                <w:color w:val="1B2630"/>
-                <w:sz w:val="17"/>
-              </w:rPr>
-              <w:t>Gesloten</w:t>
-            </w:r>
-          </w:p>
-        </w:tc>
-        <w:tc>
-          <w:tcPr>
-            <w:tcW w:type="dxa" w:w="4649"/>
-          </w:tcPr>
-          <w:p>
-            <w:pPr>
-              <w:spacing w:before="20" w:after="20"/>
-            </w:pPr>
-            <w:r>
-              <w:rPr>
-                <w:color w:val="1B2630"/>
-                <w:sz w:val="17"/>
-              </w:rPr>
-              <w:t>Open — instroom over de jaren</w:t>
-            </w:r>
-          </w:p>
-        </w:tc>
-      </w:tr>
-      <w:tr>
-        <w:tc>
-          <w:tcPr>
-            <w:tcW w:type="dxa" w:w="1587"/>
-          </w:tcPr>
-          <w:p>
-            <w:pPr>
-              <w:spacing w:before="20" w:after="20"/>
-            </w:pPr>
-            <w:r>
-              <w:rPr>
-                <w:color w:val="1B2630"/>
-                <w:sz w:val="17"/>
-              </w:rPr>
-              <w:t>Comparator</w:t>
-            </w:r>
-          </w:p>
-        </w:tc>
-        <w:tc>
-          <w:tcPr>
-            <w:tcW w:type="dxa" w:w="3628"/>
-          </w:tcPr>
-          <w:p>
-            <w:pPr>
-              <w:spacing w:before="20" w:after="20"/>
-            </w:pPr>
-            <w:r>
-              <w:rPr>
-                <w:color w:val="1B2630"/>
-                <w:sz w:val="17"/>
-              </w:rPr>
-              <w:t>Op de efficiëntiegrens</w:t>
-            </w:r>
-          </w:p>
-        </w:tc>
-        <w:tc>
-          <w:tcPr>
-            <w:tcW w:type="dxa" w:w="4649"/>
-          </w:tcPr>
-          <w:p>
-            <w:pPr>
-              <w:spacing w:before="20" w:after="20"/>
-            </w:pPr>
-            <w:r>
-              <w:rPr>
-                <w:color w:val="1B2630"/>
-                <w:sz w:val="17"/>
-              </w:rPr>
-              <w:t>De huidige situatie. PARADISE is een add-on, dus: de dagelijkse praktijk zónder PARADISE.</w:t>
-            </w:r>
-          </w:p>
-        </w:tc>
-      </w:tr>
-      <w:tr>
-        <w:tc>
-          <w:tcPr>
-            <w:tcW w:type="dxa" w:w="1587"/>
-          </w:tcPr>
-          <w:p>
-            <w:pPr>
-              <w:spacing w:before="20" w:after="20"/>
-            </w:pPr>
-            <w:r>
-              <w:rPr>
-                <w:color w:val="1B2630"/>
-                <w:sz w:val="17"/>
-              </w:rPr>
-              <w:t>Gezondheidsuitkomsten</w:t>
-            </w:r>
-          </w:p>
-        </w:tc>
-        <w:tc>
-          <w:tcPr>
-            <w:tcW w:type="dxa" w:w="3628"/>
-          </w:tcPr>
-          <w:p>
-            <w:pPr>
-              <w:spacing w:before="20" w:after="20"/>
-            </w:pPr>
-            <w:r>
-              <w:rPr>
-                <w:color w:val="1B2630"/>
-                <w:sz w:val="17"/>
-              </w:rPr>
-              <w:t>Wel</w:t>
-            </w:r>
-          </w:p>
-        </w:tc>
-        <w:tc>
-          <w:tcPr>
-            <w:tcW w:type="dxa" w:w="4649"/>
-          </w:tcPr>
-          <w:p>
-            <w:pPr>
-              <w:spacing w:before="20" w:after="20"/>
-            </w:pPr>
-            <w:r>
-              <w:rPr>
-                <w:color w:val="1B2630"/>
-                <w:sz w:val="17"/>
-              </w:rPr>
-              <w:t>Niet — geen QALY’s</w:t>
-            </w:r>
-          </w:p>
-        </w:tc>
-      </w:tr>
-      <w:tr>
-        <w:tc>
-          <w:tcPr>
-            <w:tcW w:type="dxa" w:w="1587"/>
-          </w:tcPr>
-          <w:p>
-            <w:pPr>
-              <w:spacing w:before="20" w:after="20"/>
-            </w:pPr>
-            <w:r>
-              <w:rPr>
-                <w:color w:val="1B2630"/>
-                <w:sz w:val="17"/>
-              </w:rPr>
-              <w:t>Tijdshorizon</w:t>
-            </w:r>
-          </w:p>
-        </w:tc>
-        <w:tc>
-          <w:tcPr>
-            <w:tcW w:type="dxa" w:w="3628"/>
-          </w:tcPr>
-          <w:p>
-            <w:pPr>
-              <w:spacing w:before="20" w:after="20"/>
-            </w:pPr>
-            <w:r>
-              <w:rPr>
-                <w:color w:val="1B2630"/>
-                <w:sz w:val="17"/>
-              </w:rPr>
-              <w:t>Zolang er incrementele kosten of effecten zijn</w:t>
-            </w:r>
-          </w:p>
-        </w:tc>
-        <w:tc>
-          <w:tcPr>
-            <w:tcW w:type="dxa" w:w="4649"/>
-          </w:tcPr>
-          <w:p>
-            <w:pPr>
-              <w:spacing w:before="20" w:after="20"/>
-            </w:pPr>
-            <w:r>
-              <w:rPr>
-                <w:color w:val="1B2630"/>
-                <w:sz w:val="17"/>
-              </w:rPr>
-              <w:t>Tot het regime stabiel is</w:t>
-            </w:r>
-          </w:p>
-        </w:tc>
-      </w:tr>
-      <w:tr>
-        <w:tc>
-          <w:tcPr>
-            <w:tcW w:type="dxa" w:w="1587"/>
-          </w:tcPr>
-          <w:p>
-            <w:pPr>
-              <w:spacing w:before="20" w:after="20"/>
-            </w:pPr>
-            <w:r>
-              <w:rPr>
-                <w:color w:val="1B2630"/>
-                <w:sz w:val="17"/>
-              </w:rPr>
-              <w:t>Disconto</w:t>
-            </w:r>
-          </w:p>
-        </w:tc>
-        <w:tc>
-          <w:tcPr>
-            <w:tcW w:type="dxa" w:w="3628"/>
-          </w:tcPr>
-          <w:p>
-            <w:pPr>
-              <w:spacing w:before="20" w:after="20"/>
-            </w:pPr>
-            <w:r>
-              <w:rPr>
-                <w:color w:val="1B2630"/>
-                <w:sz w:val="17"/>
-              </w:rPr>
-              <w:t>3% kosten, 1,5% effecten</w:t>
-            </w:r>
-          </w:p>
-        </w:tc>
-        <w:tc>
-          <w:tcPr>
-            <w:tcW w:type="dxa" w:w="4649"/>
-          </w:tcPr>
-          <w:p>
-            <w:pPr>
-              <w:spacing w:before="20" w:after="20"/>
-            </w:pPr>
-            <w:r>
-              <w:rPr>
-                <w:color w:val="1B2630"/>
-                <w:sz w:val="17"/>
-              </w:rPr>
-              <w:t>Géén disconto</w:t>
-            </w:r>
-          </w:p>
-        </w:tc>
-      </w:tr>
-      <w:tr>
-        <w:tc>
-          <w:tcPr>
-            <w:tcW w:type="dxa" w:w="1587"/>
-          </w:tcPr>
-          <w:p>
-            <w:pPr>
-              <w:spacing w:before="20" w:after="20"/>
-            </w:pPr>
-            <w:r>
-              <w:rPr>
-                <w:color w:val="1B2630"/>
-                <w:sz w:val="17"/>
-              </w:rPr>
-              <w:t>Onzekerheid</w:t>
-            </w:r>
-          </w:p>
-        </w:tc>
-        <w:tc>
-          <w:tcPr>
-            <w:tcW w:type="dxa" w:w="3628"/>
-          </w:tcPr>
-          <w:p>
-            <w:pPr>
-              <w:spacing w:before="20" w:after="20"/>
-            </w:pPr>
-            <w:r>
-              <w:rPr>
-                <w:color w:val="1B2630"/>
-                <w:sz w:val="17"/>
-              </w:rPr>
-              <w:t>PSA, scenario- en subgroepanalyses</w:t>
-            </w:r>
-          </w:p>
-        </w:tc>
-        <w:tc>
-          <w:tcPr>
-            <w:tcW w:type="dxa" w:w="4649"/>
-          </w:tcPr>
-          <w:p>
-            <w:pPr>
-              <w:spacing w:before="20" w:after="20"/>
-            </w:pPr>
-            <w:r>
-              <w:rPr>
-                <w:color w:val="1B2630"/>
-                <w:sz w:val="17"/>
-              </w:rPr>
-              <w:t>Deterministisch, met best- en worst-case voor variabelen zonder onderbouwing — opnamegraad is het voorbeeld dat de richtlijn geeft</w:t>
-            </w:r>
-          </w:p>
-        </w:tc>
-      </w:tr>
-      <w:tr>
-        <w:tc>
-          <w:tcPr>
-            <w:tcW w:type="dxa" w:w="1587"/>
-          </w:tcPr>
-          <w:p>
-            <w:pPr>
-              <w:spacing w:before="20" w:after="20"/>
-            </w:pPr>
-            <w:r>
-              <w:rPr>
-                <w:color w:val="1B2630"/>
-                <w:sz w:val="17"/>
-              </w:rPr>
-              <w:t>Resultaat</w:t>
-            </w:r>
-          </w:p>
-        </w:tc>
-        <w:tc>
-          <w:tcPr>
-            <w:tcW w:type="dxa" w:w="3628"/>
-          </w:tcPr>
-          <w:p>
-            <w:pPr>
-              <w:spacing w:before="20" w:after="20"/>
-            </w:pPr>
-            <w:r>
-              <w:rPr>
-                <w:color w:val="1B2630"/>
-                <w:sz w:val="17"/>
-              </w:rPr>
-              <w:t>ICUR, kosteneffectiviteitsvlak, CEAC</w:t>
-            </w:r>
-          </w:p>
-        </w:tc>
-        <w:tc>
-          <w:tcPr>
-            <w:tcW w:type="dxa" w:w="4649"/>
-          </w:tcPr>
-          <w:p>
-            <w:pPr>
-              <w:spacing w:before="20" w:after="20"/>
-            </w:pPr>
-            <w:r>
-              <w:rPr>
-                <w:color w:val="1B2630"/>
-                <w:sz w:val="17"/>
-              </w:rPr>
-              <w:t>Budgetimpact per jaar, uitgesplitst, plus de gevoeligheidsanalyses</w:t>
-            </w:r>
-          </w:p>
-        </w:tc>
-      </w:tr>
-    </w:tbl>
-    <w:p>
-      <w:pPr>
-        <w:spacing w:after="60"/>
-      </w:pPr>
-      <w:r>
-        <w:rPr>
-          <w:b w:val="0"/>
-          <w:color w:val="1B2630"/>
-          <w:sz w:val="18"/>
-        </w:rPr>
-        <w:t>Jouw voorbeeld is meteen de kern: PARADISE vraagt twee paren, standaardzorg één. In de kosteneffectiviteit verdwijnt dat in de ICUR; in de budgetimpact staat het als aparte regel, elk jaar, maal de instroom. Daar komt de timing bij die het manuscript zelf benoemt — bij preventie gaan de kosten vóór de baten. Het extra paar en de drukmeting belasten het budget meteen, de vermeden opnames komen later. Precies wat een budgetimpactanalyse zichtbaar maakt en een kosteneffectiviteitsanalyse verbergt.</w:t>
+        <w:t>Beslissen vóór de versie-lock</w:t>
       </w:r>
     </w:p>
     <w:p>
       <w:pPr>
         <w:spacing w:after="60"/>
+        <w:ind w:left="340" w:hanging="340"/>
       </w:pPr>
       <w:r>
         <w:rPr>
+          <w:b/>
+          <w:color w:val="FF7A00"/>
+          <w:sz w:val="20"/>
+        </w:rPr>
+        <w:t xml:space="preserve">3  </w:t>
+      </w:r>
+      <w:r>
+        <w:rPr>
+          <w:b/>
+          <w:color w:val="1B2630"/>
+          <w:sz w:val="20"/>
+        </w:rPr>
+        <w:t>Tijd per sessie registreren</w:t>
+      </w:r>
+      <w:r>
+        <w:rPr>
           <w:b w:val="0"/>
-          <w:color w:val="1B2630"/>
-          <w:sz w:val="18"/>
+          <w:color w:val="5A6A78"/>
+          <w:sz w:val="20"/>
         </w:rPr>
-        <w:t>Wat we ervoor nodig hebben en nu niet hebben: de omvang van de in aanmerking komende populatie in België, een opnamescenario over drie tot vijf jaar, en de meerkost per patiënt uitgesplitst — tweede paar, drukmeting, sensor, educatietijd — tegenover de vermeden zorgkosten.</w:t>
+        <w:t xml:space="preserve">  — eCRF 23 heeft geen tijdsveld, eCRF 40 enkel gemiddelden</w:t>
       </w:r>
     </w:p>
     <w:p>
       <w:pPr>
-        <w:spacing w:before="260" w:after="80"/>
+        <w:spacing w:after="60"/>
+        <w:ind w:left="340" w:hanging="340"/>
+      </w:pPr>
+      <w:r>
+        <w:rPr>
+          <w:b/>
+          <w:color w:val="FF7A00"/>
+          <w:sz w:val="20"/>
+        </w:rPr>
+        <w:t xml:space="preserve">4  </w:t>
+      </w:r>
+      <w:r>
+        <w:rPr>
+          <w:b/>
+          <w:color w:val="1B2630"/>
+          <w:sz w:val="20"/>
+        </w:rPr>
+        <w:t>Formulier dossierextractie</w:t>
+      </w:r>
+      <w:r>
+        <w:rPr>
+          <w:b w:val="0"/>
+          <w:color w:val="5A6A78"/>
+          <w:sz w:val="20"/>
+        </w:rPr>
+        <w:t xml:space="preserve">  — welke posten, wie extraheert</w:t>
+      </w:r>
+    </w:p>
+    <w:p>
+      <w:pPr>
+        <w:spacing w:after="60"/>
+        <w:ind w:left="340" w:hanging="340"/>
+      </w:pPr>
+      <w:r>
+        <w:rPr>
+          <w:b/>
+          <w:color w:val="FF7A00"/>
+          <w:sz w:val="20"/>
+        </w:rPr>
+        <w:t xml:space="preserve">5  </w:t>
+      </w:r>
+      <w:r>
+        <w:rPr>
+          <w:b/>
+          <w:color w:val="1B2630"/>
+          <w:sz w:val="20"/>
+        </w:rPr>
+        <w:t>Regel bij tegenspraak dagboek ↔ iMCQ</w:t>
+      </w:r>
+      <w:r>
+        <w:rPr>
+          <w:b w:val="0"/>
+          <w:color w:val="5A6A78"/>
+          <w:sz w:val="20"/>
+        </w:rPr>
+        <w:t xml:space="preserve">  — welke waarde telt?</w:t>
+      </w:r>
+    </w:p>
+    <w:p>
+      <w:pPr>
+        <w:spacing w:after="60"/>
+        <w:ind w:left="340" w:hanging="340"/>
+      </w:pPr>
+      <w:r>
+        <w:rPr>
+          <w:b/>
+          <w:color w:val="FF7A00"/>
+          <w:sz w:val="20"/>
+        </w:rPr>
+        <w:t xml:space="preserve">6  </w:t>
+      </w:r>
+      <w:r>
+        <w:rPr>
+          <w:b/>
+          <w:color w:val="1B2630"/>
+          <w:sz w:val="20"/>
+        </w:rPr>
+        <w:t>eCRF 33 “welk paar” alleen in Optimal Care tonen</w:t>
+      </w:r>
+    </w:p>
+    <w:p>
+      <w:pPr>
+        <w:spacing w:before="240" w:after="80"/>
       </w:pPr>
       <w:r>
         <w:rPr>
@@ -1084,132 +249,138 @@
           <w:color w:val="FF7A00"/>
           <w:sz w:val="22"/>
         </w:rPr>
-        <w:t>3  De powervraag — zonder de 144 te heropenen</w:t>
+        <w:t>Voor het analyseplan (dec)</w:t>
       </w:r>
     </w:p>
     <w:p>
       <w:pPr>
-        <w:spacing w:after="80"/>
-        <w:ind w:left="397" w:hanging="397"/>
+        <w:spacing w:after="60"/>
+        <w:ind w:left="340" w:hanging="340"/>
       </w:pPr>
       <w:r>
         <w:rPr>
           <w:b/>
           <w:color w:val="FF7A00"/>
-          <w:sz w:val="18"/>
+          <w:sz w:val="20"/>
         </w:rPr>
-        <w:t xml:space="preserve">a  </w:t>
+        <w:t xml:space="preserve">7  </w:t>
       </w:r>
       <w:r>
         <w:rPr>
           <w:b/>
           <w:color w:val="1B2630"/>
-          <w:sz w:val="18"/>
+          <w:sz w:val="20"/>
         </w:rPr>
-        <w:t xml:space="preserve">De budgetimpactanalyse heeft géén powerberekening nodig.  </w:t>
+        <w:t>Mantelzorg staat op drie formulieren</w:t>
       </w:r>
       <w:r>
         <w:rPr>
           <w:b w:val="0"/>
           <w:color w:val="5A6A78"/>
-          <w:sz w:val="18"/>
+          <w:sz w:val="20"/>
         </w:rPr>
-        <w:t>Ze is een deterministische budgetprojectie, geen toetsende analyse. KCE vangt de onzekerheid op met best- en worst-case scenario’s voor de variabelen zonder onderbouwing. Die zorg valt dus helemaal weg.</w:t>
+        <w:t xml:space="preserve">  — dubbeltelling vermijden</w:t>
       </w:r>
     </w:p>
     <w:p>
       <w:pPr>
-        <w:spacing w:after="80"/>
-        <w:ind w:left="397" w:hanging="397"/>
+        <w:spacing w:after="60"/>
+        <w:ind w:left="340" w:hanging="340"/>
       </w:pPr>
       <w:r>
         <w:rPr>
           <w:b/>
           <w:color w:val="FF7A00"/>
-          <w:sz w:val="18"/>
+          <w:sz w:val="20"/>
         </w:rPr>
-        <w:t xml:space="preserve">b  </w:t>
+        <w:t xml:space="preserve">8  </w:t>
       </w:r>
       <w:r>
         <w:rPr>
           <w:b/>
           <w:color w:val="1B2630"/>
-          <w:sz w:val="18"/>
+          <w:sz w:val="20"/>
         </w:rPr>
-        <w:t xml:space="preserve">De kostenutiliteit wordt niet gepowerd, en dat hoort ook niet.  </w:t>
+        <w:t>ICUR ook per therapietrouw (80%)?</w:t>
+      </w:r>
+    </w:p>
+    <w:p>
+      <w:pPr>
+        <w:spacing w:after="60"/>
+        <w:ind w:left="340" w:hanging="340"/>
+      </w:pPr>
+      <w:r>
+        <w:rPr>
+          <w:b/>
+          <w:color w:val="FF7A00"/>
+          <w:sz w:val="20"/>
+        </w:rPr>
+        <w:t xml:space="preserve">9  </w:t>
+      </w:r>
+      <w:r>
+        <w:rPr>
+          <w:b/>
+          <w:color w:val="1B2630"/>
+          <w:sz w:val="20"/>
+        </w:rPr>
+        <w:t>KCE-rapport 400 (2025) als referentie?</w:t>
       </w:r>
       <w:r>
         <w:rPr>
           <w:b w:val="0"/>
           <w:color w:val="5A6A78"/>
-          <w:sz w:val="18"/>
+          <w:sz w:val="20"/>
         </w:rPr>
-        <w:t>Kostendata zijn scheef met grote spreiding; powerden we daarop, dan was de vereiste steekproef onbetaalbaar. De onzekerheid wordt opgevangen door de probabilistische analyse en de CEAC — daar dient die curve voor. Concreet gevolg: géén p-waarden op kostenverschillen, wel gemiddelden met bootstrap-betrouwbaarheidsintervallen en de gezamenlijke verdeling op het kosteneffectiviteitsvlak.</w:t>
+        <w:t xml:space="preserve">  — 3% / 1,5%, scenario’s 0-3-5%, geen drempelwaarde</w:t>
       </w:r>
     </w:p>
     <w:p>
       <w:pPr>
-        <w:spacing w:after="80"/>
-        <w:ind w:left="397" w:hanging="397"/>
+        <w:spacing w:after="60"/>
+        <w:ind w:left="340" w:hanging="340"/>
       </w:pPr>
       <w:r>
         <w:rPr>
           <w:b/>
           <w:color w:val="FF7A00"/>
-          <w:sz w:val="18"/>
+          <w:sz w:val="20"/>
         </w:rPr>
-        <w:t xml:space="preserve">c  </w:t>
+        <w:t xml:space="preserve">10  </w:t>
       </w:r>
       <w:r>
         <w:rPr>
           <w:b/>
           <w:color w:val="1B2630"/>
-          <w:sz w:val="18"/>
+          <w:sz w:val="20"/>
         </w:rPr>
-        <w:t xml:space="preserve">Wat we wél doen: een precisie-uitspraak, geen powerberekening.  </w:t>
-      </w:r>
-      <w:r>
-        <w:rPr>
-          <w:b w:val="0"/>
-          <w:color w:val="5A6A78"/>
-          <w:sz w:val="18"/>
-        </w:rPr>
-        <w:t>Reken uit welk verschil in QALY’s en in kosten we met 72 per arm kunnen schátten, en met welke marge. Gebruik daarvoor de spreidingen uit DIATEMP — zelfde populatie, zelfde horizon van achttien maanden, staat al in onze referentielijst. Dat levert één zin voor protocol en analyseplan en ondervangt de reviewersvraag, zonder de 144 aan te raken. Het is geen steekproefberekening maar een uitspraak over de haalbare precisie.</w:t>
+        <w:t>Markov: bron van de utiliteiten per toestand</w:t>
       </w:r>
     </w:p>
     <w:p>
       <w:pPr>
-        <w:spacing w:after="80"/>
-        <w:ind w:left="397" w:hanging="397"/>
+        <w:spacing w:after="60"/>
+        <w:ind w:left="340" w:hanging="340"/>
       </w:pPr>
       <w:r>
         <w:rPr>
           <w:b/>
           <w:color w:val="FF7A00"/>
-          <w:sz w:val="18"/>
+          <w:sz w:val="20"/>
         </w:rPr>
-        <w:t xml:space="preserve">d  </w:t>
+        <w:t xml:space="preserve">11  </w:t>
       </w:r>
       <w:r>
         <w:rPr>
           <w:b/>
           <w:color w:val="1B2630"/>
-          <w:sz w:val="18"/>
+          <w:sz w:val="20"/>
         </w:rPr>
-        <w:t xml:space="preserve">Optioneel, als je het sterker wil maken.  </w:t>
-      </w:r>
-      <w:r>
-        <w:rPr>
-          <w:b w:val="0"/>
-          <w:color w:val="5A6A78"/>
-          <w:sz w:val="18"/>
-        </w:rPr>
-        <w:t>Een value-of-information-analyse (EVPI) op het einde: die zegt of de resterende beslissingsonzekerheid verder onderzoek rechtvaardigt. Geen vereiste, wel iets wat een economisch paper onderscheidt.</w:t>
+        <w:t>Wie doet de analyse? Eerste auteur economisch paper?</w:t>
       </w:r>
     </w:p>
     <w:p>
       <w:pPr>
-        <w:spacing w:before="260" w:after="80"/>
+        <w:spacing w:before="240" w:after="80"/>
       </w:pPr>
       <w:r>
         <w:rPr>
@@ -1217,526 +388,19 @@
           <w:color w:val="FF7A00"/>
           <w:sz w:val="22"/>
         </w:rPr>
-        <w:t>4  Nog open</w:t>
+        <w:t>Ter info — geen bespreking</w:t>
       </w:r>
     </w:p>
     <w:p>
       <w:pPr>
-        <w:spacing w:after="80"/>
-        <w:ind w:left="397" w:hanging="397"/>
+        <w:spacing w:after="60"/>
+        <w:ind w:left="340" w:hanging="340"/>
       </w:pPr>
       <w:r>
         <w:rPr>
           <w:b/>
           <w:color w:val="FF7A00"/>
-          <w:sz w:val="18"/>
-        </w:rPr>
-        <w:t xml:space="preserve">1  </w:t>
-      </w:r>
-      <w:r>
-        <w:rPr>
-          <w:b/>
-          <w:color w:val="1B2630"/>
-          <w:sz w:val="18"/>
-        </w:rPr>
-        <w:t xml:space="preserve">Mantelzorg staat op drie formulieren.  </w:t>
-      </w:r>
-      <w:r>
-        <w:rPr>
-          <w:b w:val="0"/>
-          <w:color w:val="5A6A78"/>
-          <w:sz w:val="18"/>
-        </w:rPr>
-        <w:t>eCRF 07 als ja/nee, iMCQ vraag 19 als werkelijk ontvangen uren per soort, iPCQ vraag 12 als hypothetische vervangingsuren. De laatste twee zijn conceptueel verschillend maar kunnen dezelfde uren bevatten. In de maatschappelijke analyse telt dat dubbel.</w:t>
-      </w:r>
-    </w:p>
-    <w:p>
-      <w:pPr>
-        <w:spacing w:after="80"/>
-        <w:ind w:left="397" w:hanging="397"/>
-      </w:pPr>
-      <w:r>
-        <w:rPr>
-          <w:b/>
-          <w:color w:val="FF7A00"/>
-          <w:sz w:val="18"/>
-        </w:rPr>
-        <w:t xml:space="preserve">2  </w:t>
-      </w:r>
-      <w:r>
-        <w:rPr>
-          <w:b/>
-          <w:color w:val="1B2630"/>
-          <w:sz w:val="18"/>
-        </w:rPr>
-        <w:t xml:space="preserve">Rapporteren we de ICUR ook gestratificeerd naar therapietrouw?  </w:t>
-      </w:r>
-      <w:r>
-        <w:rPr>
-          <w:b w:val="0"/>
-          <w:color w:val="5A6A78"/>
-          <w:sz w:val="18"/>
-        </w:rPr>
-        <w:t>Therapietrouw is de vooraf vastgelegde mediator, met een drempel van 80%. Het manuscript stelt vast dat DIAFOS diezelfde voorwaarde ook economisch terugvond, maar belooft geen gestratificeerde analyse. Een betaler wil weten wat hij koopt bij reële therapietrouw.</w:t>
-      </w:r>
-    </w:p>
-    <w:p>
-      <w:pPr>
-        <w:spacing w:after="80"/>
-        <w:ind w:left="397" w:hanging="397"/>
-      </w:pPr>
-      <w:r>
-        <w:rPr>
-          <w:b/>
-          <w:color w:val="FF7A00"/>
-          <w:sz w:val="18"/>
-        </w:rPr>
-        <w:t xml:space="preserve">3  </w:t>
-      </w:r>
-      <w:r>
-        <w:rPr>
-          <w:b/>
-          <w:color w:val="1B2630"/>
-          <w:sz w:val="18"/>
-        </w:rPr>
-        <w:t xml:space="preserve">De economische evaluatie is niet apart gepowerd — zetten we dat erbij?  </w:t>
-      </w:r>
-      <w:r>
-        <w:rPr>
-          <w:b w:val="0"/>
-          <w:color w:val="5A6A78"/>
-          <w:sz w:val="18"/>
-        </w:rPr>
-        <w:t>Noch protocol noch manuscript vermeldt het. Zie sectie 3c voor de formulering.</w:t>
-      </w:r>
-    </w:p>
-    <w:p>
-      <w:pPr>
-        <w:spacing w:after="80"/>
-        <w:ind w:left="397" w:hanging="397"/>
-      </w:pPr>
-      <w:r>
-        <w:rPr>
-          <w:b/>
-          <w:color w:val="FF7A00"/>
-          <w:sz w:val="18"/>
-        </w:rPr>
-        <w:t xml:space="preserve">4  </w:t>
-      </w:r>
-      <w:r>
-        <w:rPr>
-          <w:b/>
-          <w:color w:val="1B2630"/>
-          <w:sz w:val="18"/>
-        </w:rPr>
-        <w:t xml:space="preserve">eCRF 33 moet aangepast vóór de versie-lock.  </w:t>
-      </w:r>
-      <w:r>
-        <w:rPr>
-          <w:b w:val="0"/>
-          <w:color w:val="5A6A78"/>
-          <w:sz w:val="18"/>
-        </w:rPr>
-        <w:t>Het veld “welk paar is onderhouden” biedt Paar 1, Paar 2 en Beide, zonder branching, en het formulier staat in beide armen. Een Usual Care-deelnemer met één paar krijgt dus de vraag welk van twee paren onderhouden is. Branching op de arm toevoegen.</w:t>
-      </w:r>
-    </w:p>
-    <w:p>
-      <w:pPr>
-        <w:spacing w:before="260" w:after="80"/>
-      </w:pPr>
-      <w:r>
-        <w:rPr>
-          <w:b/>
-          <w:color w:val="FF7A00"/>
-          <w:sz w:val="22"/>
-        </w:rPr>
-        <w:t>5  Input voor het economisch analyseplan van december</w:t>
-      </w:r>
-    </w:p>
-    <w:p>
-      <w:pPr>
-        <w:spacing w:after="80"/>
-      </w:pPr>
-      <w:r>
-        <w:rPr>
-          <w:b w:val="0"/>
-          <w:color w:val="5A6A78"/>
-          <w:sz w:val="17"/>
-        </w:rPr>
-        <w:t>KCE-rapport 400, derde editie mei 2025 — nieuwer dan de editie van 2012.</w:t>
-      </w:r>
-    </w:p>
-    <w:tbl>
-      <w:tblPr>
-        <w:tblW w:type="auto" w:w="0"/>
-        <w:jc w:val="left"/>
-        <w:tblLayout w:type="fixed"/>
-        <w:tblLook w:firstColumn="1" w:firstRow="1" w:lastColumn="0" w:lastRow="0" w:noHBand="0" w:noVBand="1" w:val="04A0"/>
-        <w:tblBorders>
-          <w:top w:val="single" w:sz="4" w:color="D8E2EA"/>
-          <w:left w:val="single" w:sz="4" w:color="D8E2EA"/>
-          <w:bottom w:val="single" w:sz="4" w:color="D8E2EA"/>
-          <w:right w:val="single" w:sz="4" w:color="D8E2EA"/>
-          <w:insideH w:val="single" w:sz="4" w:color="D8E2EA"/>
-          <w:insideV w:val="single" w:sz="4" w:color="D8E2EA"/>
-        </w:tblBorders>
-      </w:tblPr>
-      <w:tblGrid>
-        <w:gridCol w:w="5100"/>
-        <w:gridCol w:w="5100"/>
-      </w:tblGrid>
-      <w:tr>
-        <w:tc>
-          <w:tcPr>
-            <w:tcW w:type="dxa" w:w="3175"/>
-            <w:shd w:val="clear" w:fill="1D8DB0"/>
-          </w:tcPr>
-          <w:p>
-            <w:pPr>
-              <w:spacing w:before="20" w:after="20"/>
-            </w:pPr>
-            <w:r>
-              <w:rPr>
-                <w:b/>
-                <w:color w:val="FFFFFF"/>
-                <w:sz w:val="16"/>
-              </w:rPr>
-              <w:t>WAT HET MANUSCRIPT ZEGT</w:t>
-            </w:r>
-          </w:p>
-        </w:tc>
-        <w:tc>
-          <w:tcPr>
-            <w:tcW w:type="dxa" w:w="6690"/>
-            <w:shd w:val="clear" w:fill="1D8DB0"/>
-          </w:tcPr>
-          <w:p>
-            <w:pPr>
-              <w:spacing w:before="20" w:after="20"/>
-            </w:pPr>
-            <w:r>
-              <w:rPr>
-                <w:b/>
-                <w:color w:val="FFFFFF"/>
-                <w:sz w:val="16"/>
-              </w:rPr>
-              <w:t>WAT DE RICHTLIJN VRAAGT</w:t>
-            </w:r>
-          </w:p>
-        </w:tc>
-      </w:tr>
-      <w:tr>
-        <w:tc>
-          <w:tcPr>
-            <w:tcW w:type="dxa" w:w="3175"/>
-          </w:tcPr>
-          <w:p>
-            <w:pPr>
-              <w:spacing w:before="20" w:after="20"/>
-            </w:pPr>
-            <w:r>
-              <w:rPr>
-                <w:color w:val="1B2630"/>
-                <w:sz w:val="17"/>
-              </w:rPr>
-              <w:t>Disconto “as specified in the guidance”, zonder getallen</w:t>
-            </w:r>
-          </w:p>
-        </w:tc>
-        <w:tc>
-          <w:tcPr>
-            <w:tcW w:type="dxa" w:w="6690"/>
-          </w:tcPr>
-          <w:p>
-            <w:pPr>
-              <w:spacing w:before="20" w:after="20"/>
-            </w:pPr>
-            <w:r>
-              <w:rPr>
-                <w:color w:val="1B2630"/>
-                <w:sz w:val="17"/>
-              </w:rPr>
-              <w:t>3% kosten, 1,5% effecten. Plus verplichte scenario’s met een gelijke voet van 0%, 3% en 5%.</w:t>
-            </w:r>
-          </w:p>
-        </w:tc>
-      </w:tr>
-      <w:tr>
-        <w:tc>
-          <w:tcPr>
-            <w:tcW w:type="dxa" w:w="3175"/>
-          </w:tcPr>
-          <w:p>
-            <w:pPr>
-              <w:spacing w:before="20" w:after="20"/>
-            </w:pPr>
-            <w:r>
-              <w:rPr>
-                <w:color w:val="1B2630"/>
-                <w:sz w:val="17"/>
-              </w:rPr>
-              <w:t>“standard reference prices”</w:t>
-            </w:r>
-          </w:p>
-        </w:tc>
-        <w:tc>
-          <w:tcPr>
-            <w:tcW w:type="dxa" w:w="6690"/>
-          </w:tcPr>
-          <w:p>
-            <w:pPr>
-              <w:spacing w:before="20" w:after="20"/>
-            </w:pPr>
-            <w:r>
-              <w:rPr>
-                <w:color w:val="1B2630"/>
-                <w:sz w:val="17"/>
-              </w:rPr>
-              <w:t>Gevalideerde bron bij naam, plus valuta en prijsjaar (CHEERS).</w:t>
-            </w:r>
-          </w:p>
-        </w:tc>
-      </w:tr>
-      <w:tr>
-        <w:tc>
-          <w:tcPr>
-            <w:tcW w:type="dxa" w:w="3175"/>
-          </w:tcPr>
-          <w:p>
-            <w:pPr>
-              <w:spacing w:before="20" w:after="20"/>
-            </w:pPr>
-            <w:r>
-              <w:rPr>
-                <w:color w:val="1B2630"/>
-                <w:sz w:val="17"/>
-              </w:rPr>
-              <w:t>“where no national value set applies…”</w:t>
-            </w:r>
-          </w:p>
-        </w:tc>
-        <w:tc>
-          <w:tcPr>
-            <w:tcW w:type="dxa" w:w="6690"/>
-          </w:tcPr>
-          <w:p>
-            <w:pPr>
-              <w:spacing w:before="20" w:after="20"/>
-            </w:pPr>
-            <w:r>
-              <w:rPr>
-                <w:color w:val="1B2630"/>
-                <w:sz w:val="17"/>
-              </w:rPr>
-              <w:t>Achterhaald — er is een Belgische waardeset. Clausule schrappen.</w:t>
-            </w:r>
-          </w:p>
-        </w:tc>
-      </w:tr>
-      <w:tr>
-        <w:tc>
-          <w:tcPr>
-            <w:tcW w:type="dxa" w:w="3175"/>
-          </w:tcPr>
-          <w:p>
-            <w:pPr>
-              <w:spacing w:before="20" w:after="20"/>
-            </w:pPr>
-            <w:r>
-              <w:rPr>
-                <w:color w:val="1B2630"/>
-                <w:sz w:val="17"/>
-              </w:rPr>
-              <w:t>Markov, zes toestanden</w:t>
-            </w:r>
-          </w:p>
-        </w:tc>
-        <w:tc>
-          <w:tcPr>
-            <w:tcW w:type="dxa" w:w="6690"/>
-          </w:tcPr>
-          <w:p>
-            <w:pPr>
-              <w:spacing w:before="20" w:after="20"/>
-            </w:pPr>
-            <w:r>
-              <w:rPr>
-                <w:color w:val="1B2630"/>
-                <w:sz w:val="17"/>
-              </w:rPr>
-              <w:t>Cyclusduur en half-cycle correctie ontbreken; utiliteiten met bron.</w:t>
-            </w:r>
-          </w:p>
-        </w:tc>
-      </w:tr>
-      <w:tr>
-        <w:tc>
-          <w:tcPr>
-            <w:tcW w:type="dxa" w:w="3175"/>
-          </w:tcPr>
-          <w:p>
-            <w:pPr>
-              <w:spacing w:before="20" w:after="20"/>
-            </w:pPr>
-            <w:r>
-              <w:rPr>
-                <w:color w:val="1B2630"/>
-                <w:sz w:val="17"/>
-              </w:rPr>
-              <w:t>Horizon van vijf jaar</w:t>
-            </w:r>
-          </w:p>
-        </w:tc>
-        <w:tc>
-          <w:tcPr>
-            <w:tcW w:type="dxa" w:w="6690"/>
-          </w:tcPr>
-          <w:p>
-            <w:pPr>
-              <w:spacing w:before="20" w:after="20"/>
-            </w:pPr>
-            <w:r>
-              <w:rPr>
-                <w:color w:val="1B2630"/>
-                <w:sz w:val="17"/>
-              </w:rPr>
-              <w:t>Kortere horizonnen als scenario, en motiveren waarom niet levenslang.</w:t>
-            </w:r>
-          </w:p>
-        </w:tc>
-      </w:tr>
-      <w:tr>
-        <w:tc>
-          <w:tcPr>
-            <w:tcW w:type="dxa" w:w="3175"/>
-          </w:tcPr>
-          <w:p>
-            <w:pPr>
-              <w:spacing w:before="20" w:after="20"/>
-            </w:pPr>
-            <w:r>
-              <w:rPr>
-                <w:color w:val="1B2630"/>
-                <w:sz w:val="17"/>
-              </w:rPr>
-              <w:t>“healthcare payer perspective”</w:t>
-            </w:r>
-          </w:p>
-        </w:tc>
-        <w:tc>
-          <w:tcPr>
-            <w:tcW w:type="dxa" w:w="6690"/>
-          </w:tcPr>
-          <w:p>
-            <w:pPr>
-              <w:spacing w:before="20" w:after="20"/>
-            </w:pPr>
-            <w:r>
-              <w:rPr>
-                <w:color w:val="1B2630"/>
-                <w:sz w:val="17"/>
-              </w:rPr>
-              <w:t>Omvat ook het remgeld. De dagboeken vragen dat al.</w:t>
-            </w:r>
-          </w:p>
-        </w:tc>
-      </w:tr>
-      <w:tr>
-        <w:tc>
-          <w:tcPr>
-            <w:tcW w:type="dxa" w:w="3175"/>
-          </w:tcPr>
-          <w:p>
-            <w:pPr>
-              <w:spacing w:before="20" w:after="20"/>
-            </w:pPr>
-            <w:r>
-              <w:rPr>
-                <w:color w:val="1B2630"/>
-                <w:sz w:val="17"/>
-              </w:rPr>
-              <w:t>€50 000 per QALY genoemd (bij DIATEMP)</w:t>
-            </w:r>
-          </w:p>
-        </w:tc>
-        <w:tc>
-          <w:tcPr>
-            <w:tcW w:type="dxa" w:w="6690"/>
-          </w:tcPr>
-          <w:p>
-            <w:pPr>
-              <w:spacing w:before="20" w:after="20"/>
-            </w:pPr>
-            <w:r>
-              <w:rPr>
-                <w:color w:val="1B2630"/>
-                <w:sz w:val="17"/>
-              </w:rPr>
-              <w:t>België heeft geen drempelwaarde. Drempels uit andere landen niet overnemen, aanpassen of indexeren.</w:t>
-            </w:r>
-          </w:p>
-        </w:tc>
-      </w:tr>
-      <w:tr>
-        <w:tc>
-          <w:tcPr>
-            <w:tcW w:type="dxa" w:w="3175"/>
-          </w:tcPr>
-          <w:p>
-            <w:pPr>
-              <w:spacing w:before="20" w:after="20"/>
-            </w:pPr>
-            <w:r>
-              <w:rPr>
-                <w:color w:val="1B2630"/>
-                <w:sz w:val="17"/>
-              </w:rPr>
-              <w:t>Niets over ontbrekende data of clustering</w:t>
-            </w:r>
-          </w:p>
-        </w:tc>
-        <w:tc>
-          <w:tcPr>
-            <w:tcW w:type="dxa" w:w="6690"/>
-          </w:tcPr>
-          <w:p>
-            <w:pPr>
-              <w:spacing w:before="20" w:after="20"/>
-            </w:pPr>
-            <w:r>
-              <w:rPr>
-                <w:color w:val="1B2630"/>
-                <w:sz w:val="17"/>
-              </w:rPr>
-              <w:t>Kosten en QALY’s gézamenlijk imputeren. En met 24 per centrum: hoort het centrum als toevallig effect in het kostenmodel?</w:t>
-            </w:r>
-          </w:p>
-        </w:tc>
-      </w:tr>
-    </w:tbl>
-    <w:p>
-      <w:pPr>
-        <w:spacing w:before="260" w:after="80"/>
-      </w:pPr>
-      <w:r>
-        <w:rPr>
-          <w:b/>
-          <w:color w:val="FF7A00"/>
-          <w:sz w:val="22"/>
-        </w:rPr>
-        <w:t>6  Uitgezocht — geen bespreking nodig</w:t>
-      </w:r>
-    </w:p>
-    <w:p>
-      <w:pPr>
-        <w:spacing w:after="80"/>
-        <w:ind w:left="397" w:hanging="397"/>
-      </w:pPr>
-      <w:r>
-        <w:rPr>
-          <w:b/>
-          <w:color w:val="FF7A00"/>
-          <w:sz w:val="18"/>
+          <w:sz w:val="20"/>
         </w:rPr>
         <w:t xml:space="preserve">•  </w:t>
       </w:r>
@@ -1744,29 +408,21 @@
         <w:rPr>
           <w:b/>
           <w:color w:val="1B2630"/>
-          <w:sz w:val="18"/>
+          <w:sz w:val="20"/>
         </w:rPr>
-        <w:t xml:space="preserve">Nederlands origineel van iMCQ en iPCQ, ongewijzigd.  </w:t>
-      </w:r>
-      <w:r>
-        <w:rPr>
-          <w:b w:val="0"/>
-          <w:color w:val="5A6A78"/>
-          <w:sz w:val="18"/>
-        </w:rPr>
-        <w:t>Één item is Nederlands-specifiek. Er bestaat geen Belgische versie. De A-sectie dubbelt met eCRF 07 en wordt niet afgenomen — iMTA staat weglaten van irrelevante modules toe.</w:t>
+        <w:t>iMCQ/iPCQ: Nederlands origineel, A-sectie weg, 4 weken + extrapolatie</w:t>
       </w:r>
     </w:p>
     <w:p>
       <w:pPr>
-        <w:spacing w:after="80"/>
-        <w:ind w:left="397" w:hanging="397"/>
+        <w:spacing w:after="60"/>
+        <w:ind w:left="340" w:hanging="340"/>
       </w:pPr>
       <w:r>
         <w:rPr>
           <w:b/>
           <w:color w:val="FF7A00"/>
-          <w:sz w:val="18"/>
+          <w:sz w:val="20"/>
         </w:rPr>
         <w:t xml:space="preserve">•  </w:t>
       </w:r>
@@ -1774,29 +430,21 @@
         <w:rPr>
           <w:b/>
           <w:color w:val="1B2630"/>
-          <w:sz w:val="18"/>
+          <w:sz w:val="20"/>
         </w:rPr>
-        <w:t xml:space="preserve">Terugblik blijft vier weken, met extrapolatie.  </w:t>
-      </w:r>
-      <w:r>
-        <w:rPr>
-          <w:b w:val="0"/>
-          <w:color w:val="5A6A78"/>
-          <w:sz w:val="18"/>
-        </w:rPr>
-        <w:t>Zo schrijft de iMTA-handleiding het voor; langer gaat ten koste van de accuraatheid.</w:t>
+        <w:t>Telefonisch afnemen mag — EQ-5D interviewerversie aanvragen</w:t>
       </w:r>
     </w:p>
     <w:p>
       <w:pPr>
-        <w:spacing w:after="80"/>
-        <w:ind w:left="397" w:hanging="397"/>
+        <w:spacing w:after="60"/>
+        <w:ind w:left="340" w:hanging="340"/>
       </w:pPr>
       <w:r>
         <w:rPr>
           <w:b/>
           <w:color w:val="FF7A00"/>
-          <w:sz w:val="18"/>
+          <w:sz w:val="20"/>
         </w:rPr>
         <w:t xml:space="preserve">•  </w:t>
       </w:r>
@@ -1804,95 +452,14 @@
         <w:rPr>
           <w:b/>
           <w:color w:val="1B2630"/>
-          <w:sz w:val="18"/>
+          <w:sz w:val="20"/>
         </w:rPr>
-        <w:t xml:space="preserve">Telefonisch afnemen mag.  </w:t>
-      </w:r>
-      <w:r>
-        <w:rPr>
-          <w:b w:val="0"/>
-          <w:color w:val="5A6A78"/>
-          <w:sz w:val="18"/>
-        </w:rPr>
-        <w:t>Beide handleidingen staan mondelinge afname toe. Voorwaarde: dezelfde afnamewijze in beide armen en over de hele looptijd.</w:t>
-      </w:r>
-    </w:p>
-    <w:p>
-      <w:pPr>
-        <w:spacing w:after="80"/>
-        <w:ind w:left="397" w:hanging="397"/>
-      </w:pPr>
-      <w:r>
-        <w:rPr>
-          <w:b/>
-          <w:color w:val="FF7A00"/>
-          <w:sz w:val="18"/>
-        </w:rPr>
-        <w:t xml:space="preserve">•  </w:t>
-      </w:r>
-      <w:r>
-        <w:rPr>
-          <w:b/>
-          <w:color w:val="1B2630"/>
-          <w:sz w:val="18"/>
-        </w:rPr>
-        <w:t xml:space="preserve">De verandering-vraag en de baseline zitten goed in het dagboek.  </w:t>
-      </w:r>
-      <w:r>
-        <w:rPr>
-          <w:b w:val="0"/>
-          <w:color w:val="5A6A78"/>
-          <w:sz w:val="18"/>
-        </w:rPr>
-        <w:t>45b vraagt voor staande regelingen alleen wat veranderde en noteert nieuwe gebeurtenissen telkens. Dagboek 45 dekt de baseline, met drie maanden terugblik voor consultaties en aankopen.</w:t>
-      </w:r>
-    </w:p>
-    <w:p>
-      <w:pPr>
-        <w:spacing w:after="80"/>
-        <w:ind w:left="397" w:hanging="397"/>
-      </w:pPr>
-      <w:r>
-        <w:rPr>
-          <w:b/>
-          <w:color w:val="FF7A00"/>
-          <w:sz w:val="18"/>
-        </w:rPr>
-        <w:t xml:space="preserve">•  </w:t>
-      </w:r>
-      <w:r>
-        <w:rPr>
-          <w:b/>
-          <w:color w:val="1B2630"/>
-          <w:sz w:val="18"/>
-        </w:rPr>
-        <w:t xml:space="preserve">Het protocol wijst het dagboek al als leidend aan.  </w:t>
-      </w:r>
-      <w:r>
-        <w:rPr>
-          <w:b w:val="0"/>
-          <w:color w:val="5A6A78"/>
-          <w:sz w:val="18"/>
-        </w:rPr>
-        <w:t>Open blijft alleen de regel bij tegenspraak: welke waarde gaat in de kostenberekening?</w:t>
-      </w:r>
-    </w:p>
-    <w:p>
-      <w:pPr>
-        <w:spacing w:before="200" w:after="0"/>
-      </w:pPr>
-      <w:r>
-        <w:rPr>
-          <w:b w:val="0"/>
-          <w:color w:val="5A6A78"/>
-          <w:sz w:val="15"/>
-        </w:rPr>
-        <w:t>Bron: manuscript, protocol, eCRF-set, data_dictionary en instrument_event_mapping, en PARADISE_taakverdeling_tot_start.docx, nagekeken 24 september 2026. KCE-rapport 400, richtlijnen 3, 9, 10, 11, 12, 14, 16.3 en 17 tot 25. Afnamewijze en terugblik: iMTA-handleidingen.</w:t>
+        <w:t>EuroQol geregistreerd (Belgium Flemish), iMTA nog te doen</w:t>
       </w:r>
     </w:p>
     <w:sectPr>
       <w:pgSz w:w="12240" w:h="15840"/>
-      <w:pgMar w:top="850" w:right="1020" w:bottom="850" w:left="1020" w:header="720" w:footer="720" w:gutter="0"/>
+      <w:pgMar w:top="1020" w:right="1134" w:bottom="1020" w:left="1134" w:header="720" w:footer="720" w:gutter="0"/>
       <w:cols w:space="720"/>
       <w:docGrid w:linePitch="360"/>
     </w:sectPr>
@@ -2265,7 +832,7 @@
     <w:rsid w:val="00FC693F"/>
     <w:rPr>
       <w:rFonts w:ascii="Segoe UI" w:hAnsi="Segoe UI" w:eastAsia="Segoe UI"/>
-      <w:sz w:val="18"/>
+      <w:sz w:val="20"/>
     </w:rPr>
   </w:style>
   <w:style w:type="paragraph" w:styleId="Header">

</xml_diff>